<commit_message>
feat: require google login and add player levels
</commit_message>
<xml_diff>
--- a/docs/Poli-English-Duel-Documentacao-Oficial.docx
+++ b/docs/Poli-English-Duel-Documentacao-Oficial.docx
@@ -584,7 +584,7 @@
               <w:spacing w:after="0"/>
             </w:pPr>
             <w:r>
-              <w:t xml:space="preserve">Nome, UID e foto do usuário autenticado</w:t>
+              <w:t xml:space="preserve">Nome, UID, foto do usuário autenticado, faixa e nível</w:t>
             </w:r>
           </w:p>
         </w:tc>
@@ -999,7 +999,7 @@
         <w:spacing w:before="0" w:after="90"/>
       </w:pPr>
       <w:r>
-        <w:t xml:space="preserve">Usuários não autenticados podem abrir a página inicial e consultar o ranking global. Os modos de jogo, o histórico e as operações de sala exigem autenticação.</w:t>
+        <w:t xml:space="preserve">Usuários não autenticados podem abrir a página inicial e consultar o ranking global. Os modos de jogo, o histórico e as operações de sala exigem login com Google.</w:t>
       </w:r>
     </w:p>
     <w:p>
@@ -1012,7 +1012,7 @@
         <w:spacing w:before="0" w:after="90"/>
       </w:pPr>
       <w:r>
-        <w:t xml:space="preserve">Essa decisão evita partidas sem identidade verificável e protege o ranking contra gravações arbitrárias. O Firebase Anonymous Authentication está previsto como evolução possível para oferecer a opção </w:t>
+        <w:t xml:space="preserve">Essa decisão evita partidas sem identidade verificável e protege o ranking contra gravações arbitrárias. Tokens anônimos do Firebase também são recusados pelo backend. O Firebase Anonymous Authentication permanece como evolução possível para oferecer a opção </w:t>
       </w:r>
       <w:r>
         <w:rPr>
@@ -1831,6 +1831,15 @@
         <w:ind w:left="360"/>
       </w:pPr>
       <w:r>
+        <w:t xml:space="preserve">• Ao encerrar uma sala com pelo menos dois participantes, os pontos são consolidados no ranking e no histórico.</w:t>
+      </w:r>
+    </w:p>
+    <w:p>
+      <w:pPr>
+        <w:spacing w:before="0" w:after="40"/>
+        <w:ind w:left="360"/>
+      </w:pPr>
+      <w:r>
         <w:t xml:space="preserve">• Salas ainda não finalizadas permanecem listadas para que o jogador possa retomá-las.</w:t>
       </w:r>
     </w:p>
@@ -2139,7 +2148,439 @@
         <w:spacing w:before="180" w:after="100"/>
       </w:pPr>
       <w:r>
-        <w:t xml:space="preserve">5.3 Ranking e histórico</w:t>
+        <w:t xml:space="preserve">5.3 Níveis</w:t>
+      </w:r>
+    </w:p>
+    <w:p>
+      <w:pPr>
+        <w:spacing w:after="30"/>
+      </w:pPr>
+    </w:p>
+    <w:p>
+      <w:pPr>
+        <w:spacing w:before="0" w:after="90"/>
+      </w:pPr>
+      <w:r>
+        <w:t xml:space="preserve">O XP persistido também define a progressão visual do jogador. Cada nível exige </w:t>
+      </w:r>
+      <w:r>
+        <w:rPr>
+          <w:color w:val="1E6B4F"/>
+        </w:rPr>
+        <w:t xml:space="preserve">500 XP</w:t>
+      </w:r>
+      <w:r>
+        <w:t xml:space="preserve">. A moldura da foto recebida pelo login Google muda de cor conforme a faixa.</w:t>
+      </w:r>
+    </w:p>
+    <w:p>
+      <w:pPr>
+        <w:spacing w:after="30"/>
+      </w:pPr>
+    </w:p>
+    <w:tbl>
+      <w:tblPr>
+        <w:tblW w:w="0" w:type="auto"/>
+        <w:tblBorders>
+          <w:top w:val="single" w:sz="4" w:color="B7D8C3"/>
+          <w:left w:val="single" w:sz="4" w:color="B7D8C3"/>
+          <w:bottom w:val="single" w:sz="4" w:color="B7D8C3"/>
+          <w:right w:val="single" w:sz="4" w:color="B7D8C3"/>
+          <w:insideH w:val="single" w:sz="4" w:color="B7D8C3"/>
+          <w:insideV w:val="single" w:sz="4" w:color="B7D8C3"/>
+        </w:tblBorders>
+      </w:tblPr>
+      <w:tblGrid>
+        <w:gridCol w:w="2200"/>
+        <w:gridCol w:w="2200"/>
+        <w:gridCol w:w="2200"/>
+        <w:gridCol w:w="2200"/>
+      </w:tblGrid>
+      <w:tr>
+        <w:tc>
+          <w:tcPr>
+            <w:shd w:fill="DFF5E7"/>
+            <w:tcMar>
+              <w:top w:w="80" w:type="dxa"/>
+              <w:left w:w="100" w:type="dxa"/>
+              <w:bottom w:w="80" w:type="dxa"/>
+              <w:right w:w="100" w:type="dxa"/>
+            </w:tcMar>
+          </w:tcPr>
+          <w:p>
+            <w:pPr>
+              <w:spacing w:after="0"/>
+            </w:pPr>
+            <w:r>
+              <w:t xml:space="preserve">Faixa</w:t>
+            </w:r>
+          </w:p>
+        </w:tc>
+        <w:tc>
+          <w:tcPr>
+            <w:shd w:fill="DFF5E7"/>
+            <w:tcMar>
+              <w:top w:w="80" w:type="dxa"/>
+              <w:left w:w="100" w:type="dxa"/>
+              <w:bottom w:w="80" w:type="dxa"/>
+              <w:right w:w="100" w:type="dxa"/>
+            </w:tcMar>
+          </w:tcPr>
+          <w:p>
+            <w:pPr>
+              <w:spacing w:after="0"/>
+            </w:pPr>
+            <w:r>
+              <w:t xml:space="preserve">Níveis</w:t>
+            </w:r>
+          </w:p>
+        </w:tc>
+        <w:tc>
+          <w:tcPr>
+            <w:shd w:fill="DFF5E7"/>
+            <w:tcMar>
+              <w:top w:w="80" w:type="dxa"/>
+              <w:left w:w="100" w:type="dxa"/>
+              <w:bottom w:w="80" w:type="dxa"/>
+              <w:right w:w="100" w:type="dxa"/>
+            </w:tcMar>
+          </w:tcPr>
+          <w:p>
+            <w:pPr>
+              <w:spacing w:after="0"/>
+            </w:pPr>
+            <w:r>
+              <w:t xml:space="preserve">Intervalo inicial de XP</w:t>
+            </w:r>
+          </w:p>
+        </w:tc>
+        <w:tc>
+          <w:tcPr>
+            <w:shd w:fill="DFF5E7"/>
+            <w:tcMar>
+              <w:top w:w="80" w:type="dxa"/>
+              <w:left w:w="100" w:type="dxa"/>
+              <w:bottom w:w="80" w:type="dxa"/>
+              <w:right w:w="100" w:type="dxa"/>
+            </w:tcMar>
+          </w:tcPr>
+          <w:p>
+            <w:pPr>
+              <w:spacing w:after="0"/>
+            </w:pPr>
+            <w:r>
+              <w:t xml:space="preserve">Cor da moldura</w:t>
+            </w:r>
+          </w:p>
+        </w:tc>
+      </w:tr>
+      <w:tr>
+        <w:tc>
+          <w:tcPr>
+            <w:tcMar>
+              <w:top w:w="80" w:type="dxa"/>
+              <w:left w:w="100" w:type="dxa"/>
+              <w:bottom w:w="80" w:type="dxa"/>
+              <w:right w:w="100" w:type="dxa"/>
+            </w:tcMar>
+          </w:tcPr>
+          <w:p>
+            <w:pPr>
+              <w:spacing w:after="0"/>
+            </w:pPr>
+            <w:r>
+              <w:t xml:space="preserve">Iniciante</w:t>
+            </w:r>
+          </w:p>
+        </w:tc>
+        <w:tc>
+          <w:tcPr>
+            <w:tcMar>
+              <w:top w:w="80" w:type="dxa"/>
+              <w:left w:w="100" w:type="dxa"/>
+              <w:bottom w:w="80" w:type="dxa"/>
+              <w:right w:w="100" w:type="dxa"/>
+            </w:tcMar>
+          </w:tcPr>
+          <w:p>
+            <w:pPr>
+              <w:spacing w:after="0"/>
+            </w:pPr>
+            <w:r>
+              <w:t xml:space="preserve">1 a 5</w:t>
+            </w:r>
+          </w:p>
+        </w:tc>
+        <w:tc>
+          <w:tcPr>
+            <w:tcMar>
+              <w:top w:w="80" w:type="dxa"/>
+              <w:left w:w="100" w:type="dxa"/>
+              <w:bottom w:w="80" w:type="dxa"/>
+              <w:right w:w="100" w:type="dxa"/>
+            </w:tcMar>
+          </w:tcPr>
+          <w:p>
+            <w:pPr>
+              <w:spacing w:after="0"/>
+            </w:pPr>
+            <w:r>
+              <w:t xml:space="preserve"/>
+            </w:r>
+            <w:r>
+              <w:rPr>
+                <w:color w:val="1E6B4F"/>
+              </w:rPr>
+              <w:t xml:space="preserve">0</w:t>
+            </w:r>
+            <w:r>
+              <w:t xml:space="preserve"> a </w:t>
+            </w:r>
+            <w:r>
+              <w:rPr>
+                <w:color w:val="1E6B4F"/>
+              </w:rPr>
+              <w:t xml:space="preserve">2.499 XP</w:t>
+            </w:r>
+            <w:r>
+              <w:t xml:space="preserve"/>
+            </w:r>
+          </w:p>
+        </w:tc>
+        <w:tc>
+          <w:tcPr>
+            <w:tcMar>
+              <w:top w:w="80" w:type="dxa"/>
+              <w:left w:w="100" w:type="dxa"/>
+              <w:bottom w:w="80" w:type="dxa"/>
+              <w:right w:w="100" w:type="dxa"/>
+            </w:tcMar>
+          </w:tcPr>
+          <w:p>
+            <w:pPr>
+              <w:spacing w:after="0"/>
+            </w:pPr>
+            <w:r>
+              <w:t xml:space="preserve">Verde</w:t>
+            </w:r>
+          </w:p>
+        </w:tc>
+      </w:tr>
+      <w:tr>
+        <w:tc>
+          <w:tcPr>
+            <w:tcMar>
+              <w:top w:w="80" w:type="dxa"/>
+              <w:left w:w="100" w:type="dxa"/>
+              <w:bottom w:w="80" w:type="dxa"/>
+              <w:right w:w="100" w:type="dxa"/>
+            </w:tcMar>
+          </w:tcPr>
+          <w:p>
+            <w:pPr>
+              <w:spacing w:after="0"/>
+            </w:pPr>
+            <w:r>
+              <w:t xml:space="preserve">Intermediário</w:t>
+            </w:r>
+          </w:p>
+        </w:tc>
+        <w:tc>
+          <w:tcPr>
+            <w:tcMar>
+              <w:top w:w="80" w:type="dxa"/>
+              <w:left w:w="100" w:type="dxa"/>
+              <w:bottom w:w="80" w:type="dxa"/>
+              <w:right w:w="100" w:type="dxa"/>
+            </w:tcMar>
+          </w:tcPr>
+          <w:p>
+            <w:pPr>
+              <w:spacing w:after="0"/>
+            </w:pPr>
+            <w:r>
+              <w:t xml:space="preserve">1 a 10</w:t>
+            </w:r>
+          </w:p>
+        </w:tc>
+        <w:tc>
+          <w:tcPr>
+            <w:tcMar>
+              <w:top w:w="80" w:type="dxa"/>
+              <w:left w:w="100" w:type="dxa"/>
+              <w:bottom w:w="80" w:type="dxa"/>
+              <w:right w:w="100" w:type="dxa"/>
+            </w:tcMar>
+          </w:tcPr>
+          <w:p>
+            <w:pPr>
+              <w:spacing w:after="0"/>
+            </w:pPr>
+            <w:r>
+              <w:t xml:space="preserve"/>
+            </w:r>
+            <w:r>
+              <w:rPr>
+                <w:color w:val="1E6B4F"/>
+              </w:rPr>
+              <w:t xml:space="preserve">2.500</w:t>
+            </w:r>
+            <w:r>
+              <w:t xml:space="preserve"> a </w:t>
+            </w:r>
+            <w:r>
+              <w:rPr>
+                <w:color w:val="1E6B4F"/>
+              </w:rPr>
+              <w:t xml:space="preserve">7.499 XP</w:t>
+            </w:r>
+            <w:r>
+              <w:t xml:space="preserve"/>
+            </w:r>
+          </w:p>
+        </w:tc>
+        <w:tc>
+          <w:tcPr>
+            <w:tcMar>
+              <w:top w:w="80" w:type="dxa"/>
+              <w:left w:w="100" w:type="dxa"/>
+              <w:bottom w:w="80" w:type="dxa"/>
+              <w:right w:w="100" w:type="dxa"/>
+            </w:tcMar>
+          </w:tcPr>
+          <w:p>
+            <w:pPr>
+              <w:spacing w:after="0"/>
+            </w:pPr>
+            <w:r>
+              <w:t xml:space="preserve">Roxo</w:t>
+            </w:r>
+          </w:p>
+        </w:tc>
+      </w:tr>
+      <w:tr>
+        <w:tc>
+          <w:tcPr>
+            <w:tcMar>
+              <w:top w:w="80" w:type="dxa"/>
+              <w:left w:w="100" w:type="dxa"/>
+              <w:bottom w:w="80" w:type="dxa"/>
+              <w:right w:w="100" w:type="dxa"/>
+            </w:tcMar>
+          </w:tcPr>
+          <w:p>
+            <w:pPr>
+              <w:spacing w:after="0"/>
+            </w:pPr>
+            <w:r>
+              <w:t xml:space="preserve">Avançado</w:t>
+            </w:r>
+          </w:p>
+        </w:tc>
+        <w:tc>
+          <w:tcPr>
+            <w:tcMar>
+              <w:top w:w="80" w:type="dxa"/>
+              <w:left w:w="100" w:type="dxa"/>
+              <w:bottom w:w="80" w:type="dxa"/>
+              <w:right w:w="100" w:type="dxa"/>
+            </w:tcMar>
+          </w:tcPr>
+          <w:p>
+            <w:pPr>
+              <w:spacing w:after="0"/>
+            </w:pPr>
+            <w:r>
+              <w:t xml:space="preserve">1 a 15</w:t>
+            </w:r>
+          </w:p>
+        </w:tc>
+        <w:tc>
+          <w:tcPr>
+            <w:tcMar>
+              <w:top w:w="80" w:type="dxa"/>
+              <w:left w:w="100" w:type="dxa"/>
+              <w:bottom w:w="80" w:type="dxa"/>
+              <w:right w:w="100" w:type="dxa"/>
+            </w:tcMar>
+          </w:tcPr>
+          <w:p>
+            <w:pPr>
+              <w:spacing w:after="0"/>
+            </w:pPr>
+            <w:r>
+              <w:t xml:space="preserve">A partir de </w:t>
+            </w:r>
+            <w:r>
+              <w:rPr>
+                <w:color w:val="1E6B4F"/>
+              </w:rPr>
+              <w:t xml:space="preserve">7.500 XP</w:t>
+            </w:r>
+            <w:r>
+              <w:t xml:space="preserve"/>
+            </w:r>
+          </w:p>
+        </w:tc>
+        <w:tc>
+          <w:tcPr>
+            <w:tcMar>
+              <w:top w:w="80" w:type="dxa"/>
+              <w:left w:w="100" w:type="dxa"/>
+              <w:bottom w:w="80" w:type="dxa"/>
+              <w:right w:w="100" w:type="dxa"/>
+            </w:tcMar>
+          </w:tcPr>
+          <w:p>
+            <w:pPr>
+              <w:spacing w:after="0"/>
+            </w:pPr>
+            <w:r>
+              <w:t xml:space="preserve">Âmbar</w:t>
+            </w:r>
+          </w:p>
+        </w:tc>
+      </w:tr>
+    </w:tbl>
+    <w:p>
+      <w:pPr>
+        <w:spacing w:after="80"/>
+      </w:pPr>
+    </w:p>
+    <w:p>
+      <w:pPr>
+        <w:spacing w:after="30"/>
+      </w:pPr>
+    </w:p>
+    <w:p>
+      <w:pPr>
+        <w:spacing w:before="0" w:after="90"/>
+      </w:pPr>
+      <w:r>
+        <w:t xml:space="preserve">O nível visual máximo é </w:t>
+      </w:r>
+      <w:r>
+        <w:rPr>
+          <w:b/>
+        </w:rPr>
+        <w:t xml:space="preserve">Avançado 15</w:t>
+      </w:r>
+      <w:r>
+        <w:t xml:space="preserve">. O XP continua acumulando depois desse ponto.</w:t>
+      </w:r>
+    </w:p>
+    <w:p>
+      <w:pPr>
+        <w:spacing w:after="30"/>
+      </w:pPr>
+    </w:p>
+    <w:p>
+      <w:pPr>
+        <w:pStyle w:val="Heading2"/>
+        <w:spacing w:before="180" w:after="100"/>
+      </w:pPr>
+      <w:r>
+        <w:t xml:space="preserve">5.4 Ranking e histórico</w:t>
       </w:r>
     </w:p>
     <w:p>
@@ -2220,7 +2661,7 @@
         <w:spacing w:before="180" w:after="100"/>
       </w:pPr>
       <w:r>
-        <w:t xml:space="preserve">5.4 Áudio</w:t>
+        <w:t xml:space="preserve">5.5 Áudio</w:t>
       </w:r>
     </w:p>
     <w:p>
@@ -4071,7 +4512,16 @@
         <w:spacing w:before="0" w:after="90"/>
       </w:pPr>
       <w:r>
-        <w:t xml:space="preserve">O backend valida o token consultando o Firebase Identity Toolkit e mantém um cache temporário de cinco minutos para reduzir chamadas externas.</w:t>
+        <w:t xml:space="preserve">O backend valida o token consultando o Firebase Identity Toolkit, confirma que o provedor é </w:t>
+      </w:r>
+      <w:r>
+        <w:rPr>
+          <w:color w:val="1E6B4F"/>
+        </w:rPr>
+        <w:t xml:space="preserve">google.com</w:t>
+      </w:r>
+      <w:r>
+        <w:t xml:space="preserve"> e mantém um cache temporário de cinco minutos para reduzir chamadas externas. Tokens anônimos não possuem permissão para jogar.</w:t>
       </w:r>
     </w:p>
     <w:p>
@@ -4799,6 +5249,80 @@
             </w:pPr>
             <w:r>
               <w:t xml:space="preserve">Finalidade</w:t>
+            </w:r>
+          </w:p>
+        </w:tc>
+      </w:tr>
+      <w:tr>
+        <w:tc>
+          <w:tcPr>
+            <w:tcMar>
+              <w:top w:w="80" w:type="dxa"/>
+              <w:left w:w="100" w:type="dxa"/>
+              <w:bottom w:w="80" w:type="dxa"/>
+              <w:right w:w="100" w:type="dxa"/>
+            </w:tcMar>
+          </w:tcPr>
+          <w:p>
+            <w:pPr>
+              <w:spacing w:after="0"/>
+            </w:pPr>
+            <w:r>
+              <w:t xml:space="preserve"/>
+            </w:r>
+            <w:r>
+              <w:rPr>
+                <w:color w:val="1E6B4F"/>
+              </w:rPr>
+              <w:t xml:space="preserve">GET</w:t>
+            </w:r>
+            <w:r>
+              <w:t xml:space="preserve"/>
+            </w:r>
+          </w:p>
+        </w:tc>
+        <w:tc>
+          <w:tcPr>
+            <w:tcMar>
+              <w:top w:w="80" w:type="dxa"/>
+              <w:left w:w="100" w:type="dxa"/>
+              <w:bottom w:w="80" w:type="dxa"/>
+              <w:right w:w="100" w:type="dxa"/>
+            </w:tcMar>
+          </w:tcPr>
+          <w:p>
+            <w:pPr>
+              <w:spacing w:after="0"/>
+            </w:pPr>
+            <w:r>
+              <w:t xml:space="preserve"/>
+            </w:r>
+            <w:r>
+              <w:rPr>
+                <w:color w:val="1E6B4F"/>
+              </w:rPr>
+              <w:t xml:space="preserve">/api/profile</w:t>
+            </w:r>
+            <w:r>
+              <w:t xml:space="preserve"/>
+            </w:r>
+          </w:p>
+        </w:tc>
+        <w:tc>
+          <w:tcPr>
+            <w:tcMar>
+              <w:top w:w="80" w:type="dxa"/>
+              <w:left w:w="100" w:type="dxa"/>
+              <w:bottom w:w="80" w:type="dxa"/>
+              <w:right w:w="100" w:type="dxa"/>
+            </w:tcMar>
+          </w:tcPr>
+          <w:p>
+            <w:pPr>
+              <w:spacing w:after="0"/>
+            </w:pPr>
+            <w:r>
+              <w:t xml:space="preserve">Perfil, XP e nível do usuário autenticado</w:t>
             </w:r>
           </w:p>
         </w:tc>

</xml_diff>

<commit_message>
feat: sync timers and add rematch invitations
</commit_message>
<xml_diff>
--- a/docs/Poli-English-Duel-Documentacao-Oficial.docx
+++ b/docs/Poli-English-Duel-Documentacao-Oficial.docx
@@ -660,7 +660,7 @@
               <w:spacing w:after="0"/>
             </w:pPr>
             <w:r>
-              <w:t xml:space="preserve">Link copiável e compartilhamento pelo WhatsApp</w:t>
+              <w:t xml:space="preserve">Link copiável, compartilhamento pelo WhatsApp e retomada da entrada após login</w:t>
             </w:r>
           </w:p>
         </w:tc>
@@ -1266,7 +1266,7 @@
         <w:ind w:left="360"/>
       </w:pPr>
       <w:r>
-        <w:t xml:space="preserve">8. O segundo jogador entra utilizando o código ou link.</w:t>
+        <w:t xml:space="preserve">8. O segundo jogador entra utilizando o código ou link. Ao abrir um link sem login, visualiza a sala, autentica-se com Google e segue automaticamente para a entrada.</w:t>
       </w:r>
     </w:p>
     <w:p>
@@ -1435,6 +1435,15 @@
       </w:pPr>
       <w:r>
         <w:t xml:space="preserve">• Se o conteúdo disponível para o filtro escolhido acabar, a partida é encerrada por esgotamento de conteúdo.</w:t>
+      </w:r>
+    </w:p>
+    <w:p>
+      <w:pPr>
+        <w:spacing w:before="0" w:after="40"/>
+        <w:ind w:left="360"/>
+      </w:pPr>
+      <w:r>
+        <w:t xml:space="preserve">• A barra e o contador do frontend são sincronizados com o relógio informado pelo backend.</w:t>
       </w:r>
     </w:p>
     <w:p>
@@ -2684,6 +2693,33 @@
       </w:r>
       <w:r>
         <w:t xml:space="preserve">.</w:t>
+      </w:r>
+    </w:p>
+    <w:p>
+      <w:pPr>
+        <w:spacing w:after="30"/>
+      </w:pPr>
+    </w:p>
+    <w:p>
+      <w:pPr>
+        <w:pStyle w:val="Heading2"/>
+        <w:spacing w:before="180" w:after="100"/>
+      </w:pPr>
+      <w:r>
+        <w:t xml:space="preserve">5.6 Revanche</w:t>
+      </w:r>
+    </w:p>
+    <w:p>
+      <w:pPr>
+        <w:spacing w:after="30"/>
+      </w:pPr>
+    </w:p>
+    <w:p>
+      <w:pPr>
+        <w:spacing w:before="0" w:after="90"/>
+      </w:pPr>
+      <w:r>
+        <w:t xml:space="preserve">Após um duelo tradicional, um jogador pode solicitar uma revanche. O oponente recebe um modal explícito para aceitar ou recusar, tanto na tela final quanto no menu inicial. Se aceitar depois de o solicitante retornar ao menu, o polling retoma a sala reaberta automaticamente para os dois jogadores.</w:t>
       </w:r>
     </w:p>
     <w:p>
@@ -5841,6 +5877,80 @@
             </w:pPr>
             <w:r>
               <w:t xml:space="preserve">Consultar histórico pessoal</w:t>
+            </w:r>
+          </w:p>
+        </w:tc>
+      </w:tr>
+      <w:tr>
+        <w:tc>
+          <w:tcPr>
+            <w:tcMar>
+              <w:top w:w="80" w:type="dxa"/>
+              <w:left w:w="100" w:type="dxa"/>
+              <w:bottom w:w="80" w:type="dxa"/>
+              <w:right w:w="100" w:type="dxa"/>
+            </w:tcMar>
+          </w:tcPr>
+          <w:p>
+            <w:pPr>
+              <w:spacing w:after="0"/>
+            </w:pPr>
+            <w:r>
+              <w:t xml:space="preserve"/>
+            </w:r>
+            <w:r>
+              <w:rPr>
+                <w:color w:val="1E6B4F"/>
+              </w:rPr>
+              <w:t xml:space="preserve">GET</w:t>
+            </w:r>
+            <w:r>
+              <w:t xml:space="preserve"/>
+            </w:r>
+          </w:p>
+        </w:tc>
+        <w:tc>
+          <w:tcPr>
+            <w:tcMar>
+              <w:top w:w="80" w:type="dxa"/>
+              <w:left w:w="100" w:type="dxa"/>
+              <w:bottom w:w="80" w:type="dxa"/>
+              <w:right w:w="100" w:type="dxa"/>
+            </w:tcMar>
+          </w:tcPr>
+          <w:p>
+            <w:pPr>
+              <w:spacing w:after="0"/>
+            </w:pPr>
+            <w:r>
+              <w:t xml:space="preserve"/>
+            </w:r>
+            <w:r>
+              <w:rPr>
+                <w:color w:val="1E6B4F"/>
+              </w:rPr>
+              <w:t xml:space="preserve">/api/rematches</w:t>
+            </w:r>
+            <w:r>
+              <w:t xml:space="preserve"/>
+            </w:r>
+          </w:p>
+        </w:tc>
+        <w:tc>
+          <w:tcPr>
+            <w:tcMar>
+              <w:top w:w="80" w:type="dxa"/>
+              <w:left w:w="100" w:type="dxa"/>
+              <w:bottom w:w="80" w:type="dxa"/>
+              <w:right w:w="100" w:type="dxa"/>
+            </w:tcMar>
+          </w:tcPr>
+          <w:p>
+            <w:pPr>
+              <w:spacing w:after="0"/>
+            </w:pPr>
+            <w:r>
+              <w:t xml:space="preserve">Consultar convites de revanche e salas reabertas</w:t>
             </w:r>
           </w:p>
         </w:tc>

</xml_diff>

<commit_message>
feat: add realtime multiplayer word bomb mode
</commit_message>
<xml_diff>
--- a/docs/Poli-English-Duel-Documentacao-Oficial.docx
+++ b/docs/Poli-English-Duel-Documentacao-Oficial.docx
@@ -230,7 +230,7 @@
         <w:spacing w:before="0" w:after="90"/>
       </w:pPr>
       <w:r>
-        <w:t xml:space="preserve">O objetivo central é transformar o estudo de vocabulário em sessões curtas e competitivas. Em vez de apresentar listas estáticas, o jogo oferece três experiências:</w:t>
+        <w:t xml:space="preserve">O objetivo central é transformar o estudo de vocabulário em sessões curtas e competitivas. Em vez de apresentar listas estáticas, o jogo oferece quatro experiências:</w:t>
       </w:r>
     </w:p>
     <w:p>
@@ -290,6 +290,24 @@
       </w:r>
       <w:r>
         <w:t xml:space="preserve"> descoberta colaborativa e competitiva de uma palavra secreta por proximidade semântica pedagógica.</w:t>
+      </w:r>
+    </w:p>
+    <w:p>
+      <w:pPr>
+        <w:spacing w:before="0" w:after="40"/>
+        <w:ind w:left="360"/>
+      </w:pPr>
+      <w:r>
+        <w:t xml:space="preserve">• </w:t>
+      </w:r>
+      <w:r>
+        <w:rPr>
+          <w:b/>
+        </w:rPr>
+        <w:t xml:space="preserve">Word Bomb:</w:t>
+      </w:r>
+      <w:r>
+        <w:t xml:space="preserve"> loop multiplayer de palavras com trecho obrigatório, lobby e digitação ao vivo.</w:t>
       </w:r>
     </w:p>
     <w:p>
@@ -794,6 +812,44 @@
               <w:spacing w:after="0"/>
             </w:pPr>
             <w:r>
+              <w:t xml:space="preserve">Word Bomb</w:t>
+            </w:r>
+          </w:p>
+        </w:tc>
+        <w:tc>
+          <w:tcPr>
+            <w:tcMar>
+              <w:top w:w="80" w:type="dxa"/>
+              <w:left w:w="100" w:type="dxa"/>
+              <w:bottom w:w="80" w:type="dxa"/>
+              <w:right w:w="100" w:type="dxa"/>
+            </w:tcMar>
+          </w:tcPr>
+          <w:p>
+            <w:pPr>
+              <w:spacing w:after="0"/>
+            </w:pPr>
+            <w:r>
+              <w:t xml:space="preserve">Sala multiplayer para até oito participantes com lobby, turnos e digitação ao vivo</w:t>
+            </w:r>
+          </w:p>
+        </w:tc>
+      </w:tr>
+      <w:tr>
+        <w:tc>
+          <w:tcPr>
+            <w:tcMar>
+              <w:top w:w="80" w:type="dxa"/>
+              <w:left w:w="100" w:type="dxa"/>
+              <w:bottom w:w="80" w:type="dxa"/>
+              <w:right w:w="100" w:type="dxa"/>
+            </w:tcMar>
+          </w:tcPr>
+          <w:p>
+            <w:pPr>
+              <w:spacing w:after="0"/>
+            </w:pPr>
+            <w:r>
               <w:t xml:space="preserve">Progressão</w:t>
             </w:r>
           </w:p>
@@ -2030,25 +2086,11 @@
     </w:p>
     <w:p>
       <w:pPr>
-        <w:pStyle w:val="Heading1"/>
-        <w:spacing w:before="180" w:after="100"/>
-      </w:pPr>
-      <w:r>
-        <w:t xml:space="preserve">5. Gamificação</w:t>
-      </w:r>
-    </w:p>
-    <w:p>
-      <w:pPr>
-        <w:spacing w:after="30"/>
-      </w:pPr>
-    </w:p>
-    <w:p>
-      <w:pPr>
         <w:pStyle w:val="Heading2"/>
         <w:spacing w:before="180" w:after="100"/>
       </w:pPr>
       <w:r>
-        <w:t xml:space="preserve">5.1 Corações</w:t>
+        <w:t xml:space="preserve">4.4 Word Bomb</w:t>
       </w:r>
     </w:p>
     <w:p>
@@ -2061,35 +2103,98 @@
         <w:spacing w:before="0" w:after="90"/>
       </w:pPr>
       <w:r>
-        <w:t xml:space="preserve">Nos duelos tradicionais, cada jogador começa com três corações. Uma resposta incorreta ou o estouro do cronômetro remove um coração. A interface apresenta animação visual nessa perda.</w:t>
-      </w:r>
-    </w:p>
-    <w:p>
-      <w:pPr>
-        <w:spacing w:after="30"/>
-      </w:pPr>
-    </w:p>
-    <w:p>
-      <w:pPr>
-        <w:pStyle w:val="Heading2"/>
+        <w:t xml:space="preserve">O </w:t>
+      </w:r>
+      <w:r>
+        <w:rPr>
+          <w:b/>
+        </w:rPr>
+        <w:t xml:space="preserve">Word Bomb</w:t>
+      </w:r>
+      <w:r>
+        <w:t xml:space="preserve"> adapta a dinâmica de loop de palavras para partidas multiplayer pedagógicas em inglês ou português.</w:t>
+      </w:r>
+    </w:p>
+    <w:p>
+      <w:pPr>
+        <w:spacing w:after="30"/>
+      </w:pPr>
+    </w:p>
+    <w:p>
+      <w:pPr>
+        <w:pStyle w:val="Heading3"/>
         <w:spacing w:before="180" w:after="100"/>
       </w:pPr>
       <w:r>
-        <w:t xml:space="preserve">5.2 XP e placar</w:t>
-      </w:r>
-    </w:p>
-    <w:p>
-      <w:pPr>
-        <w:spacing w:after="30"/>
-      </w:pPr>
-    </w:p>
-    <w:p>
-      <w:pPr>
-        <w:spacing w:before="0" w:after="40"/>
-        <w:ind w:left="360"/>
-      </w:pPr>
-      <w:r>
-        <w:t xml:space="preserve">• Resposta correta em duelo tradicional: </w:t>
+        <w:t xml:space="preserve">Regras</w:t>
+      </w:r>
+    </w:p>
+    <w:p>
+      <w:pPr>
+        <w:spacing w:after="30"/>
+      </w:pPr>
+    </w:p>
+    <w:p>
+      <w:pPr>
+        <w:spacing w:before="0" w:after="40"/>
+        <w:ind w:left="360"/>
+      </w:pPr>
+      <w:r>
+        <w:t xml:space="preserve">• O host escolhe o idioma ao criar a sala.</w:t>
+      </w:r>
+    </w:p>
+    <w:p>
+      <w:pPr>
+        <w:spacing w:before="0" w:after="40"/>
+        <w:ind w:left="360"/>
+      </w:pPr>
+      <w:r>
+        <w:t xml:space="preserve">• Uma sala aceita até oito participantes.</w:t>
+      </w:r>
+    </w:p>
+    <w:p>
+      <w:pPr>
+        <w:spacing w:before="0" w:after="40"/>
+        <w:ind w:left="360"/>
+      </w:pPr>
+      <w:r>
+        <w:t xml:space="preserve">• Cada jogador marca seu estado como pronto no lobby.</w:t>
+      </w:r>
+    </w:p>
+    <w:p>
+      <w:pPr>
+        <w:spacing w:before="0" w:after="40"/>
+        <w:ind w:left="360"/>
+      </w:pPr>
+      <w:r>
+        <w:t xml:space="preserve">• A partida não começa automaticamente: somente o host pode iniciá-la, e o botão fica disponível quando todos estiverem prontos.</w:t>
+      </w:r>
+    </w:p>
+    <w:p>
+      <w:pPr>
+        <w:spacing w:before="0" w:after="40"/>
+        <w:ind w:left="360"/>
+      </w:pPr>
+      <w:r>
+        <w:t xml:space="preserve">• O backend apresenta um trecho obrigatório de duas letras e alterna os turnos entre os jogadores ativos.</w:t>
+      </w:r>
+    </w:p>
+    <w:p>
+      <w:pPr>
+        <w:spacing w:before="0" w:after="40"/>
+        <w:ind w:left="360"/>
+      </w:pPr>
+      <w:r>
+        <w:t xml:space="preserve">• A palavra enviada deve existir no dicionário, conter o trecho apresentado e ainda não ter sido utilizada na partida.</w:t>
+      </w:r>
+    </w:p>
+    <w:p>
+      <w:pPr>
+        <w:spacing w:before="0" w:after="40"/>
+        <w:ind w:left="360"/>
+      </w:pPr>
+      <w:r>
+        <w:t xml:space="preserve">• Uma resposta válida concede </w:t>
       </w:r>
       <w:r>
         <w:rPr>
@@ -2098,25 +2203,139 @@
         <w:t xml:space="preserve">100 XP</w:t>
       </w:r>
       <w:r>
-        <w:t xml:space="preserve">.</w:t>
-      </w:r>
-    </w:p>
-    <w:p>
-      <w:pPr>
-        <w:spacing w:before="0" w:after="40"/>
-        <w:ind w:left="360"/>
-      </w:pPr>
-      <w:r>
-        <w:t xml:space="preserve">• Word Radar: pontuação proporcional à proximidade.</w:t>
-      </w:r>
-    </w:p>
-    <w:p>
-      <w:pPr>
-        <w:spacing w:before="0" w:after="40"/>
-        <w:ind w:left="360"/>
-      </w:pPr>
-      <w:r>
-        <w:t xml:space="preserve">• Word Radar exato: pontos de proximidade mais bônus de </w:t>
+        <w:t xml:space="preserve"> e passa o turno.</w:t>
+      </w:r>
+    </w:p>
+    <w:p>
+      <w:pPr>
+        <w:spacing w:before="0" w:after="40"/>
+        <w:ind w:left="360"/>
+      </w:pPr>
+      <w:r>
+        <w:t xml:space="preserve">• Uma resposta inválida pode ser corrigida enquanto ainda houver tempo.</w:t>
+      </w:r>
+    </w:p>
+    <w:p>
+      <w:pPr>
+        <w:spacing w:before="0" w:after="40"/>
+        <w:ind w:left="360"/>
+      </w:pPr>
+      <w:r>
+        <w:t xml:space="preserve">• Quando o cronômetro de dez segundos termina, o jogador perde um coração e o turno avança.</w:t>
+      </w:r>
+    </w:p>
+    <w:p>
+      <w:pPr>
+        <w:spacing w:before="0" w:after="40"/>
+        <w:ind w:left="360"/>
+      </w:pPr>
+      <w:r>
+        <w:t xml:space="preserve">• O último jogador com corações vence.</w:t>
+      </w:r>
+    </w:p>
+    <w:p>
+      <w:pPr>
+        <w:spacing w:before="0" w:after="40"/>
+        <w:ind w:left="360"/>
+      </w:pPr>
+      <w:r>
+        <w:t xml:space="preserve">• Durante o turno, todos os participantes visualizam a digitação do jogador ativo em tempo real.</w:t>
+      </w:r>
+    </w:p>
+    <w:p>
+      <w:pPr>
+        <w:spacing w:after="30"/>
+      </w:pPr>
+    </w:p>
+    <w:p>
+      <w:pPr>
+        <w:pStyle w:val="Heading3"/>
+        <w:spacing w:before="180" w:after="100"/>
+      </w:pPr>
+      <w:r>
+        <w:t xml:space="preserve">Arquitetura híbrida</w:t>
+      </w:r>
+    </w:p>
+    <w:p>
+      <w:pPr>
+        <w:spacing w:after="30"/>
+      </w:pPr>
+    </w:p>
+    <w:p>
+      <w:pPr>
+        <w:spacing w:before="0" w:after="90"/>
+      </w:pPr>
+      <w:r>
+        <w:t xml:space="preserve">O Python continua autoritativo para lobby, participantes, início, turnos, validação, vidas, encerramento, XP e histórico. O Firebase Realtime Database transporta apenas o rascunho temporário digitado pelo jogador ativo. Esse dado não concede pontos e não altera o resultado da partida.</w:t>
+      </w:r>
+    </w:p>
+    <w:p>
+      <w:pPr>
+        <w:spacing w:after="30"/>
+      </w:pPr>
+    </w:p>
+    <w:p>
+      <w:pPr>
+        <w:pStyle w:val="Heading1"/>
+        <w:spacing w:before="180" w:after="100"/>
+      </w:pPr>
+      <w:r>
+        <w:t xml:space="preserve">5. Gamificação</w:t>
+      </w:r>
+    </w:p>
+    <w:p>
+      <w:pPr>
+        <w:spacing w:after="30"/>
+      </w:pPr>
+    </w:p>
+    <w:p>
+      <w:pPr>
+        <w:pStyle w:val="Heading2"/>
+        <w:spacing w:before="180" w:after="100"/>
+      </w:pPr>
+      <w:r>
+        <w:t xml:space="preserve">5.1 Corações</w:t>
+      </w:r>
+    </w:p>
+    <w:p>
+      <w:pPr>
+        <w:spacing w:after="30"/>
+      </w:pPr>
+    </w:p>
+    <w:p>
+      <w:pPr>
+        <w:spacing w:before="0" w:after="90"/>
+      </w:pPr>
+      <w:r>
+        <w:t xml:space="preserve">Nos duelos tradicionais, cada jogador começa com três corações. Uma resposta incorreta ou o estouro do cronômetro remove um coração. A interface apresenta animação visual nessa perda.</w:t>
+      </w:r>
+    </w:p>
+    <w:p>
+      <w:pPr>
+        <w:spacing w:after="30"/>
+      </w:pPr>
+    </w:p>
+    <w:p>
+      <w:pPr>
+        <w:pStyle w:val="Heading2"/>
+        <w:spacing w:before="180" w:after="100"/>
+      </w:pPr>
+      <w:r>
+        <w:t xml:space="preserve">5.2 XP e placar</w:t>
+      </w:r>
+    </w:p>
+    <w:p>
+      <w:pPr>
+        <w:spacing w:after="30"/>
+      </w:pPr>
+    </w:p>
+    <w:p>
+      <w:pPr>
+        <w:spacing w:before="0" w:after="40"/>
+        <w:ind w:left="360"/>
+      </w:pPr>
+      <w:r>
+        <w:t xml:space="preserve">• Resposta correta em duelo tradicional: </w:t>
       </w:r>
       <w:r>
         <w:rPr>
@@ -2126,6 +2345,51 @@
       </w:r>
       <w:r>
         <w:t xml:space="preserve">.</w:t>
+      </w:r>
+    </w:p>
+    <w:p>
+      <w:pPr>
+        <w:spacing w:before="0" w:after="40"/>
+        <w:ind w:left="360"/>
+      </w:pPr>
+      <w:r>
+        <w:t xml:space="preserve">• Word Radar: pontuação proporcional à proximidade.</w:t>
+      </w:r>
+    </w:p>
+    <w:p>
+      <w:pPr>
+        <w:spacing w:before="0" w:after="40"/>
+        <w:ind w:left="360"/>
+      </w:pPr>
+      <w:r>
+        <w:t xml:space="preserve">• Word Radar exato: pontos de proximidade mais bônus de </w:t>
+      </w:r>
+      <w:r>
+        <w:rPr>
+          <w:color w:val="1E6B4F"/>
+        </w:rPr>
+        <w:t xml:space="preserve">100 XP</w:t>
+      </w:r>
+      <w:r>
+        <w:t xml:space="preserve">.</w:t>
+      </w:r>
+    </w:p>
+    <w:p>
+      <w:pPr>
+        <w:spacing w:before="0" w:after="40"/>
+        <w:ind w:left="360"/>
+      </w:pPr>
+      <w:r>
+        <w:t xml:space="preserve">• Word Bomb: </w:t>
+      </w:r>
+      <w:r>
+        <w:rPr>
+          <w:color w:val="1E6B4F"/>
+        </w:rPr>
+        <w:t xml:space="preserve">100 XP</w:t>
+      </w:r>
+      <w:r>
+        <w:t xml:space="preserve"> por palavra válida.</w:t>
       </w:r>
     </w:p>
     <w:p>
@@ -3744,9 +4008,11 @@
   v
 server.py / regras autoritativas do jogo
   |
-  +--&gt; SQLite: salas, Word Radar, ranking e histórico
+  +--&gt; SQLite: salas, Word Radar, Word Bomb, ranking e histórico
   |
-  +--&gt; Firebase Identity Toolkit: validação do token do usuário</w:t>
+  +--&gt; Firebase Identity Toolkit: validação do token do usuário
+  |
+  +--&gt; Firebase Realtime Database: digitação temporária ao vivo do Word Bomb</w:t>
       </w:r>
     </w:p>
     <w:p>
@@ -4304,6 +4570,53 @@
               <w:rPr>
                 <w:color w:val="1E6B4F"/>
               </w:rPr>
+              <w:t xml:space="preserve">bombs</w:t>
+            </w:r>
+            <w:r>
+              <w:t xml:space="preserve"/>
+            </w:r>
+          </w:p>
+        </w:tc>
+        <w:tc>
+          <w:tcPr>
+            <w:tcMar>
+              <w:top w:w="80" w:type="dxa"/>
+              <w:left w:w="100" w:type="dxa"/>
+              <w:bottom w:w="80" w:type="dxa"/>
+              <w:right w:w="100" w:type="dxa"/>
+            </w:tcMar>
+          </w:tcPr>
+          <w:p>
+            <w:pPr>
+              <w:spacing w:after="0"/>
+            </w:pPr>
+            <w:r>
+              <w:t xml:space="preserve">Lobby e estado competitivo autoritativo das salas Word Bomb</w:t>
+            </w:r>
+          </w:p>
+        </w:tc>
+      </w:tr>
+      <w:tr>
+        <w:tc>
+          <w:tcPr>
+            <w:tcMar>
+              <w:top w:w="80" w:type="dxa"/>
+              <w:left w:w="100" w:type="dxa"/>
+              <w:bottom w:w="80" w:type="dxa"/>
+              <w:right w:w="100" w:type="dxa"/>
+            </w:tcMar>
+          </w:tcPr>
+          <w:p>
+            <w:pPr>
+              <w:spacing w:after="0"/>
+            </w:pPr>
+            <w:r>
+              <w:t xml:space="preserve"/>
+            </w:r>
+            <w:r>
+              <w:rPr>
+                <w:color w:val="1E6B4F"/>
+              </w:rPr>
               <w:t xml:space="preserve">rankings</w:t>
             </w:r>
             <w:r>
@@ -4651,7 +4964,7 @@
         <w:spacing w:before="0" w:after="90"/>
       </w:pPr>
       <w:r>
-        <w:t xml:space="preserve">O Firebase Realtime Database foi configurado inicialmente, porém o navegador não grava o estado das partidas diretamente nele. As regras publicadas bloqueiam leitura e escrita:</w:t>
+        <w:t xml:space="preserve">O Firebase Realtime Database não recebe estado competitivo. No Word Bomb, ele transmite somente a digitação temporária ao vivo. Cada usuário autenticado pode escrever ou apagar apenas o próprio rascunho, limitado a 32 caracteres:</w:t>
       </w:r>
     </w:p>
     <w:p>
@@ -4674,7 +4987,17 @@
         <w:t xml:space="preserve">{
   "rules": {
     ".read": false,
-    ".write": false
+    ".write": false,
+    "liveBombRooms": {
+      "$room": {
+        "typing": {
+          ".read": "auth != null",
+          "$uid": {
+            ".write": "auth != null &amp;&amp; auth.uid === $uid"
+          }
+        }
+      }
+    }
   }
 }</w:t>
       </w:r>
@@ -6513,6 +6836,699 @@
     </w:p>
     <w:p>
       <w:pPr>
+        <w:pStyle w:val="Heading2"/>
+        <w:spacing w:before="180" w:after="100"/>
+      </w:pPr>
+      <w:r>
+        <w:t xml:space="preserve">9.4 Endpoints autenticados do Word Bomb</w:t>
+      </w:r>
+    </w:p>
+    <w:p>
+      <w:pPr>
+        <w:spacing w:after="30"/>
+      </w:pPr>
+    </w:p>
+    <w:tbl>
+      <w:tblPr>
+        <w:tblW w:w="0" w:type="auto"/>
+        <w:tblBorders>
+          <w:top w:val="single" w:sz="4" w:color="B7D8C3"/>
+          <w:left w:val="single" w:sz="4" w:color="B7D8C3"/>
+          <w:bottom w:val="single" w:sz="4" w:color="B7D8C3"/>
+          <w:right w:val="single" w:sz="4" w:color="B7D8C3"/>
+          <w:insideH w:val="single" w:sz="4" w:color="B7D8C3"/>
+          <w:insideV w:val="single" w:sz="4" w:color="B7D8C3"/>
+        </w:tblBorders>
+      </w:tblPr>
+      <w:tblGrid>
+        <w:gridCol w:w="2200"/>
+        <w:gridCol w:w="2200"/>
+        <w:gridCol w:w="2200"/>
+      </w:tblGrid>
+      <w:tr>
+        <w:tc>
+          <w:tcPr>
+            <w:shd w:fill="DFF5E7"/>
+            <w:tcMar>
+              <w:top w:w="80" w:type="dxa"/>
+              <w:left w:w="100" w:type="dxa"/>
+              <w:bottom w:w="80" w:type="dxa"/>
+              <w:right w:w="100" w:type="dxa"/>
+            </w:tcMar>
+          </w:tcPr>
+          <w:p>
+            <w:pPr>
+              <w:spacing w:after="0"/>
+            </w:pPr>
+            <w:r>
+              <w:t xml:space="preserve">Método</w:t>
+            </w:r>
+          </w:p>
+        </w:tc>
+        <w:tc>
+          <w:tcPr>
+            <w:shd w:fill="DFF5E7"/>
+            <w:tcMar>
+              <w:top w:w="80" w:type="dxa"/>
+              <w:left w:w="100" w:type="dxa"/>
+              <w:bottom w:w="80" w:type="dxa"/>
+              <w:right w:w="100" w:type="dxa"/>
+            </w:tcMar>
+          </w:tcPr>
+          <w:p>
+            <w:pPr>
+              <w:spacing w:after="0"/>
+            </w:pPr>
+            <w:r>
+              <w:t xml:space="preserve">Endpoint</w:t>
+            </w:r>
+          </w:p>
+        </w:tc>
+        <w:tc>
+          <w:tcPr>
+            <w:shd w:fill="DFF5E7"/>
+            <w:tcMar>
+              <w:top w:w="80" w:type="dxa"/>
+              <w:left w:w="100" w:type="dxa"/>
+              <w:bottom w:w="80" w:type="dxa"/>
+              <w:right w:w="100" w:type="dxa"/>
+            </w:tcMar>
+          </w:tcPr>
+          <w:p>
+            <w:pPr>
+              <w:spacing w:after="0"/>
+            </w:pPr>
+            <w:r>
+              <w:t xml:space="preserve">Finalidade</w:t>
+            </w:r>
+          </w:p>
+        </w:tc>
+      </w:tr>
+      <w:tr>
+        <w:tc>
+          <w:tcPr>
+            <w:tcMar>
+              <w:top w:w="80" w:type="dxa"/>
+              <w:left w:w="100" w:type="dxa"/>
+              <w:bottom w:w="80" w:type="dxa"/>
+              <w:right w:w="100" w:type="dxa"/>
+            </w:tcMar>
+          </w:tcPr>
+          <w:p>
+            <w:pPr>
+              <w:spacing w:after="0"/>
+            </w:pPr>
+            <w:r>
+              <w:t xml:space="preserve"/>
+            </w:r>
+            <w:r>
+              <w:rPr>
+                <w:color w:val="1E6B4F"/>
+              </w:rPr>
+              <w:t xml:space="preserve">POST</w:t>
+            </w:r>
+            <w:r>
+              <w:t xml:space="preserve"/>
+            </w:r>
+          </w:p>
+        </w:tc>
+        <w:tc>
+          <w:tcPr>
+            <w:tcMar>
+              <w:top w:w="80" w:type="dxa"/>
+              <w:left w:w="100" w:type="dxa"/>
+              <w:bottom w:w="80" w:type="dxa"/>
+              <w:right w:w="100" w:type="dxa"/>
+            </w:tcMar>
+          </w:tcPr>
+          <w:p>
+            <w:pPr>
+              <w:spacing w:after="0"/>
+            </w:pPr>
+            <w:r>
+              <w:t xml:space="preserve"/>
+            </w:r>
+            <w:r>
+              <w:rPr>
+                <w:color w:val="1E6B4F"/>
+              </w:rPr>
+              <w:t xml:space="preserve">/api/bombs</w:t>
+            </w:r>
+            <w:r>
+              <w:t xml:space="preserve"/>
+            </w:r>
+          </w:p>
+        </w:tc>
+        <w:tc>
+          <w:tcPr>
+            <w:tcMar>
+              <w:top w:w="80" w:type="dxa"/>
+              <w:left w:w="100" w:type="dxa"/>
+              <w:bottom w:w="80" w:type="dxa"/>
+              <w:right w:w="100" w:type="dxa"/>
+            </w:tcMar>
+          </w:tcPr>
+          <w:p>
+            <w:pPr>
+              <w:spacing w:after="0"/>
+            </w:pPr>
+            <w:r>
+              <w:t xml:space="preserve">Criar sala e escolher idioma</w:t>
+            </w:r>
+          </w:p>
+        </w:tc>
+      </w:tr>
+      <w:tr>
+        <w:tc>
+          <w:tcPr>
+            <w:tcMar>
+              <w:top w:w="80" w:type="dxa"/>
+              <w:left w:w="100" w:type="dxa"/>
+              <w:bottom w:w="80" w:type="dxa"/>
+              <w:right w:w="100" w:type="dxa"/>
+            </w:tcMar>
+          </w:tcPr>
+          <w:p>
+            <w:pPr>
+              <w:spacing w:after="0"/>
+            </w:pPr>
+            <w:r>
+              <w:t xml:space="preserve"/>
+            </w:r>
+            <w:r>
+              <w:rPr>
+                <w:color w:val="1E6B4F"/>
+              </w:rPr>
+              <w:t xml:space="preserve">GET</w:t>
+            </w:r>
+            <w:r>
+              <w:t xml:space="preserve"/>
+            </w:r>
+          </w:p>
+        </w:tc>
+        <w:tc>
+          <w:tcPr>
+            <w:tcMar>
+              <w:top w:w="80" w:type="dxa"/>
+              <w:left w:w="100" w:type="dxa"/>
+              <w:bottom w:w="80" w:type="dxa"/>
+              <w:right w:w="100" w:type="dxa"/>
+            </w:tcMar>
+          </w:tcPr>
+          <w:p>
+            <w:pPr>
+              <w:spacing w:after="0"/>
+            </w:pPr>
+            <w:r>
+              <w:t xml:space="preserve"/>
+            </w:r>
+            <w:r>
+              <w:rPr>
+                <w:color w:val="1E6B4F"/>
+              </w:rPr>
+              <w:t xml:space="preserve">/api/bombs</w:t>
+            </w:r>
+            <w:r>
+              <w:t xml:space="preserve"/>
+            </w:r>
+          </w:p>
+        </w:tc>
+        <w:tc>
+          <w:tcPr>
+            <w:tcMar>
+              <w:top w:w="80" w:type="dxa"/>
+              <w:left w:w="100" w:type="dxa"/>
+              <w:bottom w:w="80" w:type="dxa"/>
+              <w:right w:w="100" w:type="dxa"/>
+            </w:tcMar>
+          </w:tcPr>
+          <w:p>
+            <w:pPr>
+              <w:spacing w:after="0"/>
+            </w:pPr>
+            <w:r>
+              <w:t xml:space="preserve">Listar salas abertas do usuário</w:t>
+            </w:r>
+          </w:p>
+        </w:tc>
+      </w:tr>
+      <w:tr>
+        <w:tc>
+          <w:tcPr>
+            <w:tcMar>
+              <w:top w:w="80" w:type="dxa"/>
+              <w:left w:w="100" w:type="dxa"/>
+              <w:bottom w:w="80" w:type="dxa"/>
+              <w:right w:w="100" w:type="dxa"/>
+            </w:tcMar>
+          </w:tcPr>
+          <w:p>
+            <w:pPr>
+              <w:spacing w:after="0"/>
+            </w:pPr>
+            <w:r>
+              <w:t xml:space="preserve"/>
+            </w:r>
+            <w:r>
+              <w:rPr>
+                <w:color w:val="1E6B4F"/>
+              </w:rPr>
+              <w:t xml:space="preserve">GET</w:t>
+            </w:r>
+            <w:r>
+              <w:t xml:space="preserve"/>
+            </w:r>
+          </w:p>
+        </w:tc>
+        <w:tc>
+          <w:tcPr>
+            <w:tcMar>
+              <w:top w:w="80" w:type="dxa"/>
+              <w:left w:w="100" w:type="dxa"/>
+              <w:bottom w:w="80" w:type="dxa"/>
+              <w:right w:w="100" w:type="dxa"/>
+            </w:tcMar>
+          </w:tcPr>
+          <w:p>
+            <w:pPr>
+              <w:spacing w:after="0"/>
+            </w:pPr>
+            <w:r>
+              <w:t xml:space="preserve"/>
+            </w:r>
+            <w:r>
+              <w:rPr>
+                <w:color w:val="1E6B4F"/>
+              </w:rPr>
+              <w:t xml:space="preserve">/api/bombs/&lt;code&gt;</w:t>
+            </w:r>
+            <w:r>
+              <w:t xml:space="preserve"/>
+            </w:r>
+          </w:p>
+        </w:tc>
+        <w:tc>
+          <w:tcPr>
+            <w:tcMar>
+              <w:top w:w="80" w:type="dxa"/>
+              <w:left w:w="100" w:type="dxa"/>
+              <w:bottom w:w="80" w:type="dxa"/>
+              <w:right w:w="100" w:type="dxa"/>
+            </w:tcMar>
+          </w:tcPr>
+          <w:p>
+            <w:pPr>
+              <w:spacing w:after="0"/>
+            </w:pPr>
+            <w:r>
+              <w:t xml:space="preserve">Consultar lobby ou partida</w:t>
+            </w:r>
+          </w:p>
+        </w:tc>
+      </w:tr>
+      <w:tr>
+        <w:tc>
+          <w:tcPr>
+            <w:tcMar>
+              <w:top w:w="80" w:type="dxa"/>
+              <w:left w:w="100" w:type="dxa"/>
+              <w:bottom w:w="80" w:type="dxa"/>
+              <w:right w:w="100" w:type="dxa"/>
+            </w:tcMar>
+          </w:tcPr>
+          <w:p>
+            <w:pPr>
+              <w:spacing w:after="0"/>
+            </w:pPr>
+            <w:r>
+              <w:t xml:space="preserve"/>
+            </w:r>
+            <w:r>
+              <w:rPr>
+                <w:color w:val="1E6B4F"/>
+              </w:rPr>
+              <w:t xml:space="preserve">POST</w:t>
+            </w:r>
+            <w:r>
+              <w:t xml:space="preserve"/>
+            </w:r>
+          </w:p>
+        </w:tc>
+        <w:tc>
+          <w:tcPr>
+            <w:tcMar>
+              <w:top w:w="80" w:type="dxa"/>
+              <w:left w:w="100" w:type="dxa"/>
+              <w:bottom w:w="80" w:type="dxa"/>
+              <w:right w:w="100" w:type="dxa"/>
+            </w:tcMar>
+          </w:tcPr>
+          <w:p>
+            <w:pPr>
+              <w:spacing w:after="0"/>
+            </w:pPr>
+            <w:r>
+              <w:t xml:space="preserve"/>
+            </w:r>
+            <w:r>
+              <w:rPr>
+                <w:color w:val="1E6B4F"/>
+              </w:rPr>
+              <w:t xml:space="preserve">/api/bombs/&lt;code&gt;/join</w:t>
+            </w:r>
+            <w:r>
+              <w:t xml:space="preserve"/>
+            </w:r>
+          </w:p>
+        </w:tc>
+        <w:tc>
+          <w:tcPr>
+            <w:tcMar>
+              <w:top w:w="80" w:type="dxa"/>
+              <w:left w:w="100" w:type="dxa"/>
+              <w:bottom w:w="80" w:type="dxa"/>
+              <w:right w:w="100" w:type="dxa"/>
+            </w:tcMar>
+          </w:tcPr>
+          <w:p>
+            <w:pPr>
+              <w:spacing w:after="0"/>
+            </w:pPr>
+            <w:r>
+              <w:t xml:space="preserve">Entrar na sala</w:t>
+            </w:r>
+          </w:p>
+        </w:tc>
+      </w:tr>
+      <w:tr>
+        <w:tc>
+          <w:tcPr>
+            <w:tcMar>
+              <w:top w:w="80" w:type="dxa"/>
+              <w:left w:w="100" w:type="dxa"/>
+              <w:bottom w:w="80" w:type="dxa"/>
+              <w:right w:w="100" w:type="dxa"/>
+            </w:tcMar>
+          </w:tcPr>
+          <w:p>
+            <w:pPr>
+              <w:spacing w:after="0"/>
+            </w:pPr>
+            <w:r>
+              <w:t xml:space="preserve"/>
+            </w:r>
+            <w:r>
+              <w:rPr>
+                <w:color w:val="1E6B4F"/>
+              </w:rPr>
+              <w:t xml:space="preserve">POST</w:t>
+            </w:r>
+            <w:r>
+              <w:t xml:space="preserve"/>
+            </w:r>
+          </w:p>
+        </w:tc>
+        <w:tc>
+          <w:tcPr>
+            <w:tcMar>
+              <w:top w:w="80" w:type="dxa"/>
+              <w:left w:w="100" w:type="dxa"/>
+              <w:bottom w:w="80" w:type="dxa"/>
+              <w:right w:w="100" w:type="dxa"/>
+            </w:tcMar>
+          </w:tcPr>
+          <w:p>
+            <w:pPr>
+              <w:spacing w:after="0"/>
+            </w:pPr>
+            <w:r>
+              <w:t xml:space="preserve"/>
+            </w:r>
+            <w:r>
+              <w:rPr>
+                <w:color w:val="1E6B4F"/>
+              </w:rPr>
+              <w:t xml:space="preserve">/api/bombs/&lt;code&gt;/ready</w:t>
+            </w:r>
+            <w:r>
+              <w:t xml:space="preserve"/>
+            </w:r>
+          </w:p>
+        </w:tc>
+        <w:tc>
+          <w:tcPr>
+            <w:tcMar>
+              <w:top w:w="80" w:type="dxa"/>
+              <w:left w:w="100" w:type="dxa"/>
+              <w:bottom w:w="80" w:type="dxa"/>
+              <w:right w:w="100" w:type="dxa"/>
+            </w:tcMar>
+          </w:tcPr>
+          <w:p>
+            <w:pPr>
+              <w:spacing w:after="0"/>
+            </w:pPr>
+            <w:r>
+              <w:t xml:space="preserve">Confirmar ou cancelar estado pronto</w:t>
+            </w:r>
+          </w:p>
+        </w:tc>
+      </w:tr>
+      <w:tr>
+        <w:tc>
+          <w:tcPr>
+            <w:tcMar>
+              <w:top w:w="80" w:type="dxa"/>
+              <w:left w:w="100" w:type="dxa"/>
+              <w:bottom w:w="80" w:type="dxa"/>
+              <w:right w:w="100" w:type="dxa"/>
+            </w:tcMar>
+          </w:tcPr>
+          <w:p>
+            <w:pPr>
+              <w:spacing w:after="0"/>
+            </w:pPr>
+            <w:r>
+              <w:t xml:space="preserve"/>
+            </w:r>
+            <w:r>
+              <w:rPr>
+                <w:color w:val="1E6B4F"/>
+              </w:rPr>
+              <w:t xml:space="preserve">POST</w:t>
+            </w:r>
+            <w:r>
+              <w:t xml:space="preserve"/>
+            </w:r>
+          </w:p>
+        </w:tc>
+        <w:tc>
+          <w:tcPr>
+            <w:tcMar>
+              <w:top w:w="80" w:type="dxa"/>
+              <w:left w:w="100" w:type="dxa"/>
+              <w:bottom w:w="80" w:type="dxa"/>
+              <w:right w:w="100" w:type="dxa"/>
+            </w:tcMar>
+          </w:tcPr>
+          <w:p>
+            <w:pPr>
+              <w:spacing w:after="0"/>
+            </w:pPr>
+            <w:r>
+              <w:t xml:space="preserve"/>
+            </w:r>
+            <w:r>
+              <w:rPr>
+                <w:color w:val="1E6B4F"/>
+              </w:rPr>
+              <w:t xml:space="preserve">/api/bombs/&lt;code&gt;/start</w:t>
+            </w:r>
+            <w:r>
+              <w:t xml:space="preserve"/>
+            </w:r>
+          </w:p>
+        </w:tc>
+        <w:tc>
+          <w:tcPr>
+            <w:tcMar>
+              <w:top w:w="80" w:type="dxa"/>
+              <w:left w:w="100" w:type="dxa"/>
+              <w:bottom w:w="80" w:type="dxa"/>
+              <w:right w:w="100" w:type="dxa"/>
+            </w:tcMar>
+          </w:tcPr>
+          <w:p>
+            <w:pPr>
+              <w:spacing w:after="0"/>
+            </w:pPr>
+            <w:r>
+              <w:t xml:space="preserve">Iniciar partida como host</w:t>
+            </w:r>
+          </w:p>
+        </w:tc>
+      </w:tr>
+      <w:tr>
+        <w:tc>
+          <w:tcPr>
+            <w:tcMar>
+              <w:top w:w="80" w:type="dxa"/>
+              <w:left w:w="100" w:type="dxa"/>
+              <w:bottom w:w="80" w:type="dxa"/>
+              <w:right w:w="100" w:type="dxa"/>
+            </w:tcMar>
+          </w:tcPr>
+          <w:p>
+            <w:pPr>
+              <w:spacing w:after="0"/>
+            </w:pPr>
+            <w:r>
+              <w:t xml:space="preserve"/>
+            </w:r>
+            <w:r>
+              <w:rPr>
+                <w:color w:val="1E6B4F"/>
+              </w:rPr>
+              <w:t xml:space="preserve">POST</w:t>
+            </w:r>
+            <w:r>
+              <w:t xml:space="preserve"/>
+            </w:r>
+          </w:p>
+        </w:tc>
+        <w:tc>
+          <w:tcPr>
+            <w:tcMar>
+              <w:top w:w="80" w:type="dxa"/>
+              <w:left w:w="100" w:type="dxa"/>
+              <w:bottom w:w="80" w:type="dxa"/>
+              <w:right w:w="100" w:type="dxa"/>
+            </w:tcMar>
+          </w:tcPr>
+          <w:p>
+            <w:pPr>
+              <w:spacing w:after="0"/>
+            </w:pPr>
+            <w:r>
+              <w:t xml:space="preserve"/>
+            </w:r>
+            <w:r>
+              <w:rPr>
+                <w:color w:val="1E6B4F"/>
+              </w:rPr>
+              <w:t xml:space="preserve">/api/bombs/&lt;code&gt;/answer</w:t>
+            </w:r>
+            <w:r>
+              <w:t xml:space="preserve"/>
+            </w:r>
+          </w:p>
+        </w:tc>
+        <w:tc>
+          <w:tcPr>
+            <w:tcMar>
+              <w:top w:w="80" w:type="dxa"/>
+              <w:left w:w="100" w:type="dxa"/>
+              <w:bottom w:w="80" w:type="dxa"/>
+              <w:right w:w="100" w:type="dxa"/>
+            </w:tcMar>
+          </w:tcPr>
+          <w:p>
+            <w:pPr>
+              <w:spacing w:after="0"/>
+            </w:pPr>
+            <w:r>
+              <w:t xml:space="preserve">Enviar palavra do turno</w:t>
+            </w:r>
+          </w:p>
+        </w:tc>
+      </w:tr>
+      <w:tr>
+        <w:tc>
+          <w:tcPr>
+            <w:tcMar>
+              <w:top w:w="80" w:type="dxa"/>
+              <w:left w:w="100" w:type="dxa"/>
+              <w:bottom w:w="80" w:type="dxa"/>
+              <w:right w:w="100" w:type="dxa"/>
+            </w:tcMar>
+          </w:tcPr>
+          <w:p>
+            <w:pPr>
+              <w:spacing w:after="0"/>
+            </w:pPr>
+            <w:r>
+              <w:t xml:space="preserve"/>
+            </w:r>
+            <w:r>
+              <w:rPr>
+                <w:color w:val="1E6B4F"/>
+              </w:rPr>
+              <w:t xml:space="preserve">POST</w:t>
+            </w:r>
+            <w:r>
+              <w:t xml:space="preserve"/>
+            </w:r>
+          </w:p>
+        </w:tc>
+        <w:tc>
+          <w:tcPr>
+            <w:tcMar>
+              <w:top w:w="80" w:type="dxa"/>
+              <w:left w:w="100" w:type="dxa"/>
+              <w:bottom w:w="80" w:type="dxa"/>
+              <w:right w:w="100" w:type="dxa"/>
+            </w:tcMar>
+          </w:tcPr>
+          <w:p>
+            <w:pPr>
+              <w:spacing w:after="0"/>
+            </w:pPr>
+            <w:r>
+              <w:t xml:space="preserve"/>
+            </w:r>
+            <w:r>
+              <w:rPr>
+                <w:color w:val="1E6B4F"/>
+              </w:rPr>
+              <w:t xml:space="preserve">/api/bombs/&lt;code&gt;/leave</w:t>
+            </w:r>
+            <w:r>
+              <w:t xml:space="preserve"/>
+            </w:r>
+          </w:p>
+        </w:tc>
+        <w:tc>
+          <w:tcPr>
+            <w:tcMar>
+              <w:top w:w="80" w:type="dxa"/>
+              <w:left w:w="100" w:type="dxa"/>
+              <w:bottom w:w="80" w:type="dxa"/>
+              <w:right w:w="100" w:type="dxa"/>
+            </w:tcMar>
+          </w:tcPr>
+          <w:p>
+            <w:pPr>
+              <w:spacing w:after="0"/>
+            </w:pPr>
+            <w:r>
+              <w:t xml:space="preserve">Sair da sala</w:t>
+            </w:r>
+          </w:p>
+        </w:tc>
+      </w:tr>
+    </w:tbl>
+    <w:p>
+      <w:pPr>
+        <w:spacing w:after="80"/>
+      </w:pPr>
+    </w:p>
+    <w:p>
+      <w:pPr>
+        <w:spacing w:after="30"/>
+      </w:pPr>
+    </w:p>
+    <w:p>
+      <w:pPr>
         <w:pStyle w:val="Heading1"/>
         <w:spacing w:before="180" w:after="100"/>
       </w:pPr>
@@ -7328,7 +8344,7 @@
               <w:spacing w:after="0"/>
             </w:pPr>
             <w:r>
-              <w:t xml:space="preserve">Regras restritivas do Realtime Database</w:t>
+              <w:t xml:space="preserve">Regras restritivas com exceção do rascunho temporário do Word Bomb</w:t>
             </w:r>
           </w:p>
         </w:tc>

</xml_diff>

<commit_message>
feat: intensify word bomb turns and prefix input
</commit_message>
<xml_diff>
--- a/docs/Poli-English-Duel-Documentacao-Oficial.docx
+++ b/docs/Poli-English-Duel-Documentacao-Oficial.docx
@@ -2176,16 +2176,52 @@
         <w:ind w:left="360"/>
       </w:pPr>
       <w:r>
-        <w:t xml:space="preserve">• O backend apresenta um trecho obrigatório de duas letras e alterna os turnos entre os jogadores ativos.</w:t>
-      </w:r>
-    </w:p>
-    <w:p>
-      <w:pPr>
-        <w:spacing w:before="0" w:after="40"/>
-        <w:ind w:left="360"/>
-      </w:pPr>
-      <w:r>
-        <w:t xml:space="preserve">• A palavra enviada deve existir no dicionário, conter o trecho apresentado e ainda não ter sido utilizada na partida.</w:t>
+        <w:t xml:space="preserve">• O backend apresenta um prefixo obrigatório de duas letras e alterna os turnos entre os jogadores ativos.</w:t>
+      </w:r>
+    </w:p>
+    <w:p>
+      <w:pPr>
+        <w:spacing w:before="0" w:after="40"/>
+        <w:ind w:left="360"/>
+      </w:pPr>
+      <w:r>
+        <w:t xml:space="preserve">• O prefixo permanece fixo na tela. O participante digita somente o complemento: para </w:t>
+      </w:r>
+      <w:r>
+        <w:rPr>
+          <w:color w:val="1E6B4F"/>
+        </w:rPr>
+        <w:t xml:space="preserve">PA</w:t>
+      </w:r>
+      <w:r>
+        <w:t xml:space="preserve">, escreve </w:t>
+      </w:r>
+      <w:r>
+        <w:rPr>
+          <w:color w:val="1E6B4F"/>
+        </w:rPr>
+        <w:t xml:space="preserve">RADA</w:t>
+      </w:r>
+      <w:r>
+        <w:t xml:space="preserve"> e envia </w:t>
+      </w:r>
+      <w:r>
+        <w:rPr>
+          <w:color w:val="1E6B4F"/>
+        </w:rPr>
+        <w:t xml:space="preserve">PARADA</w:t>
+      </w:r>
+      <w:r>
+        <w:t xml:space="preserve">.</w:t>
+      </w:r>
+    </w:p>
+    <w:p>
+      <w:pPr>
+        <w:spacing w:before="0" w:after="40"/>
+        <w:ind w:left="360"/>
+      </w:pPr>
+      <w:r>
+        <w:t xml:space="preserve">• A palavra montada deve existir no dicionário, começar com o prefixo apresentado e ainda não ter sido utilizada na partida.</w:t>
       </w:r>
     </w:p>
     <w:p>
@@ -2239,7 +2275,25 @@
         <w:ind w:left="360"/>
       </w:pPr>
       <w:r>
-        <w:t xml:space="preserve">• Durante o turno, todos os participantes visualizam a digitação do jogador ativo em tempo real.</w:t>
+        <w:t xml:space="preserve">• Durante o turno, todos os participantes visualizam a palavra sendo completada pelo jogador ativo em tempo real.</w:t>
+      </w:r>
+    </w:p>
+    <w:p>
+      <w:pPr>
+        <w:spacing w:before="0" w:after="40"/>
+        <w:ind w:left="360"/>
+      </w:pPr>
+      <w:r>
+        <w:t xml:space="preserve">• Uma seta destaca explicitamente o jogador responsável pelo turno.</w:t>
+      </w:r>
+    </w:p>
+    <w:p>
+      <w:pPr>
+        <w:spacing w:before="0" w:after="40"/>
+        <w:ind w:left="360"/>
+      </w:pPr>
+      <w:r>
+        <w:t xml:space="preserve">• Nos três segundos finais, a arena, o contador e a barra recebem um alerta visual vermelho pulsante.</w:t>
       </w:r>
     </w:p>
     <w:p>

</xml_diff>

<commit_message>
feat: redesign word bomb battle arena
</commit_message>
<xml_diff>
--- a/docs/Poli-English-Duel-Documentacao-Oficial.docx
+++ b/docs/Poli-English-Duel-Documentacao-Oficial.docx
@@ -2294,6 +2294,15 @@
       </w:pPr>
       <w:r>
         <w:t xml:space="preserve">• Nos três segundos finais, a arena, o contador e a barra recebem um alerta visual vermelho pulsante.</w:t>
+      </w:r>
+    </w:p>
+    <w:p>
+      <w:pPr>
+        <w:spacing w:before="0" w:after="40"/>
+        <w:ind w:left="360"/>
+      </w:pPr>
+      <w:r>
+        <w:t xml:space="preserve">• A arena apresenta os jogadores nas laterais, a bomba com contador no centro e um campo inferior amplo para acomodar palavras longas.</w:t>
       </w:r>
     </w:p>
     <w:p>

</xml_diff>

<commit_message>
feat: add remote word bomb vocabulary cache
</commit_message>
<xml_diff>
--- a/docs/Poli-English-Duel-Documentacao-Oficial.docx
+++ b/docs/Poli-English-Duel-Documentacao-Oficial.docx
@@ -2330,6 +2330,19 @@
       </w:pPr>
       <w:r>
         <w:t xml:space="preserve">O Python continua autoritativo para lobby, participantes, início, turnos, validação, vidas, encerramento, XP e histórico. O Firebase Realtime Database transporta apenas o rascunho temporário digitado pelo jogador ativo. Esse dado não concede pontos e não altera o resultado da partida.</w:t>
+      </w:r>
+    </w:p>
+    <w:p>
+      <w:pPr>
+        <w:spacing w:after="30"/>
+      </w:pPr>
+    </w:p>
+    <w:p>
+      <w:pPr>
+        <w:spacing w:before="0" w:after="90"/>
+      </w:pPr>
+      <w:r>
+        <w:t xml:space="preserve">Para ampliar a aceitação de respostas sem sobrecarregar o espaço do PythonAnywhere, o backend também pode consultar blocos públicos de vocabulário particionados por idioma e prefixo no Realtime Database. Cada bloco é mantido em cache após a primeira consulta. A indisponibilidade do Firebase não interrompe a partida, pois a base local permanece como fallback.</w:t>
       </w:r>
     </w:p>
     <w:p>
@@ -5027,7 +5040,7 @@
         <w:spacing w:before="0" w:after="90"/>
       </w:pPr>
       <w:r>
-        <w:t xml:space="preserve">O Firebase Realtime Database não recebe estado competitivo. No Word Bomb, ele transmite somente a digitação temporária ao vivo. Cada usuário autenticado pode escrever ou apagar apenas o próprio rascunho, limitado a 32 caracteres:</w:t>
+        <w:t xml:space="preserve">O Firebase Realtime Database não recebe estado competitivo. No Word Bomb, ele transmite somente a digitação temporária ao vivo. Cada usuário autenticado pode escrever ou apagar apenas o próprio rascunho, limitado a 64 caracteres. O banco também expõe publicamente os blocos estáticos de vocabulário amplo:</w:t>
       </w:r>
     </w:p>
     <w:p>
@@ -5051,6 +5064,10 @@
   "rules": {
     ".read": false,
     ".write": false,
+    "bombVocabulary": {
+      ".read": true,
+      ".write": false
+    },
     "liveBombRooms": {
       "$room": {
         "typing": {
@@ -5089,7 +5106,7 @@
         <w:spacing w:before="180" w:after="100"/>
       </w:pPr>
       <w:r>
-        <w:t xml:space="preserve">8.4 Palavra secreta protegida</w:t>
+        <w:t xml:space="preserve">8.4 Vocabulário remoto particionado</w:t>
       </w:r>
     </w:p>
     <w:p>
@@ -5102,7 +5119,232 @@
         <w:spacing w:before="0" w:after="90"/>
       </w:pPr>
       <w:r>
-        <w:t xml:space="preserve">No Word Radar, a palavra secreta não é enviada ao frontend enquanto a partida está ativa. A resposta permanece no backend e apenas o resultado público das tentativas é retornado.</w:t>
+        <w:t xml:space="preserve">O script </w:t>
+      </w:r>
+      <w:r>
+        <w:rPr>
+          <w:color w:val="1E6B4F"/>
+        </w:rPr>
+        <w:t xml:space="preserve">scripts/build_firebase_bomb_vocabulary.py</w:t>
+      </w:r>
+      <w:r>
+        <w:t xml:space="preserve"> combina:</w:t>
+      </w:r>
+    </w:p>
+    <w:p>
+      <w:pPr>
+        <w:spacing w:after="30"/>
+      </w:pPr>
+    </w:p>
+    <w:p>
+      <w:pPr>
+        <w:spacing w:before="0" w:after="40"/>
+        <w:ind w:left="360"/>
+      </w:pPr>
+      <w:r>
+        <w:t xml:space="preserve">• Índice FreeDict </w:t>
+      </w:r>
+      <w:r>
+        <w:rPr>
+          <w:color w:val="1E6B4F"/>
+        </w:rPr>
+        <w:t xml:space="preserve">eng-por 0.3</w:t>
+      </w:r>
+      <w:r>
+        <w:t xml:space="preserve">.</w:t>
+      </w:r>
+    </w:p>
+    <w:p>
+      <w:pPr>
+        <w:spacing w:before="0" w:after="40"/>
+        <w:ind w:left="360"/>
+      </w:pPr>
+      <w:r>
+        <w:t xml:space="preserve">• Dicionário Hunspell </w:t>
+      </w:r>
+      <w:r>
+        <w:rPr>
+          <w:color w:val="1E6B4F"/>
+        </w:rPr>
+        <w:t xml:space="preserve">en_US</w:t>
+      </w:r>
+      <w:r>
+        <w:t xml:space="preserve"> do LibreOffice.</w:t>
+      </w:r>
+    </w:p>
+    <w:p>
+      <w:pPr>
+        <w:spacing w:before="0" w:after="40"/>
+        <w:ind w:left="360"/>
+      </w:pPr>
+      <w:r>
+        <w:t xml:space="preserve">• Dicionário Hunspell </w:t>
+      </w:r>
+      <w:r>
+        <w:rPr>
+          <w:color w:val="1E6B4F"/>
+        </w:rPr>
+        <w:t xml:space="preserve">pt_BR</w:t>
+      </w:r>
+      <w:r>
+        <w:t xml:space="preserve"> do LibreOffice.</w:t>
+      </w:r>
+    </w:p>
+    <w:p>
+      <w:pPr>
+        <w:spacing w:after="30"/>
+      </w:pPr>
+    </w:p>
+    <w:p>
+      <w:pPr>
+        <w:spacing w:before="0" w:after="90"/>
+      </w:pPr>
+      <w:r>
+        <w:t xml:space="preserve">O resultado é salvo localmente em </w:t>
+      </w:r>
+      <w:r>
+        <w:rPr>
+          <w:color w:val="1E6B4F"/>
+        </w:rPr>
+        <w:t xml:space="preserve">data/firebase-bomb-vocabulary.json</w:t>
+      </w:r>
+      <w:r>
+        <w:t xml:space="preserve">, arquivo gerado e ignorado pelo Git. Para publicar:</w:t>
+      </w:r>
+    </w:p>
+    <w:p>
+      <w:pPr>
+        <w:spacing w:after="30"/>
+      </w:pPr>
+    </w:p>
+    <w:p>
+      <w:pPr>
+        <w:spacing w:before="0" w:after="40"/>
+        <w:ind w:left="360"/>
+      </w:pPr>
+      <w:r>
+        <w:t xml:space="preserve">1. Execute </w:t>
+      </w:r>
+      <w:r>
+        <w:rPr>
+          <w:color w:val="1E6B4F"/>
+        </w:rPr>
+        <w:t xml:space="preserve">python scripts/build_firebase_bomb_vocabulary.py</w:t>
+      </w:r>
+      <w:r>
+        <w:t xml:space="preserve">.</w:t>
+      </w:r>
+    </w:p>
+    <w:p>
+      <w:pPr>
+        <w:spacing w:before="0" w:after="40"/>
+        <w:ind w:left="360"/>
+      </w:pPr>
+      <w:r>
+        <w:t xml:space="preserve">2. Abra </w:t>
+      </w:r>
+      <w:r>
+        <w:rPr>
+          <w:b/>
+        </w:rPr>
+        <w:t xml:space="preserve">Firebase Console &gt; Realtime Database &gt; Data</w:t>
+      </w:r>
+      <w:r>
+        <w:t xml:space="preserve">.</w:t>
+      </w:r>
+    </w:p>
+    <w:p>
+      <w:pPr>
+        <w:spacing w:before="0" w:after="40"/>
+        <w:ind w:left="360"/>
+      </w:pPr>
+      <w:r>
+        <w:t xml:space="preserve">3. Crie ou selecione o nó </w:t>
+      </w:r>
+      <w:r>
+        <w:rPr>
+          <w:color w:val="1E6B4F"/>
+        </w:rPr>
+        <w:t xml:space="preserve">/bombVocabulary</w:t>
+      </w:r>
+      <w:r>
+        <w:t xml:space="preserve">.</w:t>
+      </w:r>
+    </w:p>
+    <w:p>
+      <w:pPr>
+        <w:spacing w:before="0" w:after="40"/>
+        <w:ind w:left="360"/>
+      </w:pPr>
+      <w:r>
+        <w:t xml:space="preserve">4. Use </w:t>
+      </w:r>
+      <w:r>
+        <w:rPr>
+          <w:b/>
+        </w:rPr>
+        <w:t xml:space="preserve">Import JSON</w:t>
+      </w:r>
+      <w:r>
+        <w:t xml:space="preserve"> com o arquivo gerado.</w:t>
+      </w:r>
+    </w:p>
+    <w:p>
+      <w:pPr>
+        <w:spacing w:before="0" w:after="40"/>
+        <w:ind w:left="360"/>
+      </w:pPr>
+      <w:r>
+        <w:t xml:space="preserve">5. Publique </w:t>
+      </w:r>
+      <w:r>
+        <w:rPr>
+          <w:color w:val="1E6B4F"/>
+        </w:rPr>
+        <w:t xml:space="preserve">firebase.rules.json</w:t>
+      </w:r>
+      <w:r>
+        <w:t xml:space="preserve"> em </w:t>
+      </w:r>
+      <w:r>
+        <w:rPr>
+          <w:b/>
+        </w:rPr>
+        <w:t xml:space="preserve">Realtime Database &gt; Rules</w:t>
+      </w:r>
+      <w:r>
+        <w:t xml:space="preserve">.</w:t>
+      </w:r>
+    </w:p>
+    <w:p>
+      <w:pPr>
+        <w:spacing w:after="30"/>
+      </w:pPr>
+    </w:p>
+    <w:p>
+      <w:pPr>
+        <w:spacing w:before="0" w:after="90"/>
+      </w:pPr>
+      <w:r>
+        <w:t xml:space="preserve">O backend consulta caminhos como </w:t>
+      </w:r>
+      <w:r>
+        <w:rPr>
+          <w:color w:val="1E6B4F"/>
+        </w:rPr>
+        <w:t xml:space="preserve">/bombVocabulary/chunks/pt/pa</w:t>
+      </w:r>
+      <w:r>
+        <w:t xml:space="preserve">. A variável opcional </w:t>
+      </w:r>
+      <w:r>
+        <w:rPr>
+          <w:color w:val="1E6B4F"/>
+        </w:rPr>
+        <w:t xml:space="preserve">POLI_REMOTE_BOMB_VOCABULARY=0</w:t>
+      </w:r>
+      <w:r>
+        <w:t xml:space="preserve"> desativa a consulta remota sem remover o fallback local.</w:t>
       </w:r>
     </w:p>
     <w:p>
@@ -5116,7 +5358,34 @@
         <w:spacing w:before="180" w:after="100"/>
       </w:pPr>
       <w:r>
-        <w:t xml:space="preserve">8.5 Limites atuais</w:t>
+        <w:t xml:space="preserve">8.5 Palavra secreta protegida</w:t>
+      </w:r>
+    </w:p>
+    <w:p>
+      <w:pPr>
+        <w:spacing w:after="30"/>
+      </w:pPr>
+    </w:p>
+    <w:p>
+      <w:pPr>
+        <w:spacing w:before="0" w:after="90"/>
+      </w:pPr>
+      <w:r>
+        <w:t xml:space="preserve">No Word Radar, a palavra secreta não é enviada ao frontend enquanto a partida está ativa. A resposta permanece no backend e apenas o resultado público das tentativas é retornado.</w:t>
+      </w:r>
+    </w:p>
+    <w:p>
+      <w:pPr>
+        <w:spacing w:after="30"/>
+      </w:pPr>
+    </w:p>
+    <w:p>
+      <w:pPr>
+        <w:pStyle w:val="Heading2"/>
+        <w:spacing w:before="180" w:after="100"/>
+      </w:pPr>
+      <w:r>
+        <w:t xml:space="preserve">8.6 Limites atuais</w:t>
       </w:r>
     </w:p>
     <w:p>
@@ -8267,6 +8536,53 @@
             </w:pPr>
             <w:r>
               <w:t xml:space="preserve">Processamento FreeDict</w:t>
+            </w:r>
+          </w:p>
+        </w:tc>
+      </w:tr>
+      <w:tr>
+        <w:tc>
+          <w:tcPr>
+            <w:tcMar>
+              <w:top w:w="80" w:type="dxa"/>
+              <w:left w:w="100" w:type="dxa"/>
+              <w:bottom w:w="80" w:type="dxa"/>
+              <w:right w:w="100" w:type="dxa"/>
+            </w:tcMar>
+          </w:tcPr>
+          <w:p>
+            <w:pPr>
+              <w:spacing w:after="0"/>
+            </w:pPr>
+            <w:r>
+              <w:t xml:space="preserve"/>
+            </w:r>
+            <w:r>
+              <w:rPr>
+                <w:color w:val="1E6B4F"/>
+              </w:rPr>
+              <w:t xml:space="preserve">scripts/build_firebase_bomb_vocabulary.py</w:t>
+            </w:r>
+            <w:r>
+              <w:t xml:space="preserve"/>
+            </w:r>
+          </w:p>
+        </w:tc>
+        <w:tc>
+          <w:tcPr>
+            <w:tcMar>
+              <w:top w:w="80" w:type="dxa"/>
+              <w:left w:w="100" w:type="dxa"/>
+              <w:bottom w:w="80" w:type="dxa"/>
+              <w:right w:w="100" w:type="dxa"/>
+            </w:tcMar>
+          </w:tcPr>
+          <w:p>
+            <w:pPr>
+              <w:spacing w:after="0"/>
+            </w:pPr>
+            <w:r>
+              <w:t xml:space="preserve">Geração do payload remoto particionado do Word Bomb</w:t>
             </w:r>
           </w:p>
         </w:tc>

</xml_diff>

<commit_message>
feat: refine word bomb arena and lounge music
</commit_message>
<xml_diff>
--- a/docs/Poli-English-Duel-Documentacao-Oficial.docx
+++ b/docs/Poli-English-Duel-Documentacao-Oficial.docx
@@ -2176,52 +2176,43 @@
         <w:ind w:left="360"/>
       </w:pPr>
       <w:r>
-        <w:t xml:space="preserve">• O backend apresenta um prefixo obrigatório de duas letras e alterna os turnos entre os jogadores ativos.</w:t>
-      </w:r>
-    </w:p>
-    <w:p>
-      <w:pPr>
-        <w:spacing w:before="0" w:after="40"/>
-        <w:ind w:left="360"/>
-      </w:pPr>
-      <w:r>
-        <w:t xml:space="preserve">• O prefixo permanece fixo na tela. O participante digita somente o complemento: para </w:t>
+        <w:t xml:space="preserve">• O backend apresenta uma sílaba obrigatória de duas letras e alterna os turnos entre os jogadores ativos.</w:t>
+      </w:r>
+    </w:p>
+    <w:p>
+      <w:pPr>
+        <w:spacing w:before="0" w:after="40"/>
+        <w:ind w:left="360"/>
+      </w:pPr>
+      <w:r>
+        <w:t xml:space="preserve">• O participante digita a palavra completa.</w:t>
+      </w:r>
+    </w:p>
+    <w:p>
+      <w:pPr>
+        <w:spacing w:before="0" w:after="40"/>
+        <w:ind w:left="360"/>
+      </w:pPr>
+      <w:r>
+        <w:t xml:space="preserve">• A palavra deve existir no dicionário, conter a sílaba exibida em qualquer posição e ainda não ter sido utilizada na partida. Exemplo: a sílaba </w:t>
       </w:r>
       <w:r>
         <w:rPr>
           <w:color w:val="1E6B4F"/>
         </w:rPr>
-        <w:t xml:space="preserve">PA</w:t>
-      </w:r>
-      <w:r>
-        <w:t xml:space="preserve">, escreve </w:t>
+        <w:t xml:space="preserve">OO</w:t>
+      </w:r>
+      <w:r>
+        <w:t xml:space="preserve"> aceita </w:t>
       </w:r>
       <w:r>
         <w:rPr>
           <w:color w:val="1E6B4F"/>
         </w:rPr>
-        <w:t xml:space="preserve">RADA</w:t>
-      </w:r>
-      <w:r>
-        <w:t xml:space="preserve"> e envia </w:t>
-      </w:r>
-      <w:r>
-        <w:rPr>
-          <w:color w:val="1E6B4F"/>
-        </w:rPr>
-        <w:t xml:space="preserve">PARADA</w:t>
+        <w:t xml:space="preserve">BOOK</w:t>
       </w:r>
       <w:r>
         <w:t xml:space="preserve">.</w:t>
-      </w:r>
-    </w:p>
-    <w:p>
-      <w:pPr>
-        <w:spacing w:before="0" w:after="40"/>
-        <w:ind w:left="360"/>
-      </w:pPr>
-      <w:r>
-        <w:t xml:space="preserve">• A palavra montada deve existir no dicionário, começar com o prefixo apresentado e ainda não ter sido utilizada na partida.</w:t>
       </w:r>
     </w:p>
     <w:p>
@@ -2275,16 +2266,16 @@
         <w:ind w:left="360"/>
       </w:pPr>
       <w:r>
-        <w:t xml:space="preserve">• Durante o turno, todos os participantes visualizam a palavra sendo completada pelo jogador ativo em tempo real.</w:t>
-      </w:r>
-    </w:p>
-    <w:p>
-      <w:pPr>
-        <w:spacing w:before="0" w:after="40"/>
-        <w:ind w:left="360"/>
-      </w:pPr>
-      <w:r>
-        <w:t xml:space="preserve">• Uma seta destaca explicitamente o jogador responsável pelo turno.</w:t>
+        <w:t xml:space="preserve">• Durante o turno, todos os participantes visualizam a palavra completa sendo digitada pelo jogador ativo em tempo real.</w:t>
+      </w:r>
+    </w:p>
+    <w:p>
+      <w:pPr>
+        <w:spacing w:before="0" w:after="40"/>
+        <w:ind w:left="360"/>
+      </w:pPr>
+      <w:r>
+        <w:t xml:space="preserve">• Os jogadores são distribuídos simetricamente ao redor da bomba. Uma seta sai do centro e aponta diretamente para o participante responsável pelo turno.</w:t>
       </w:r>
     </w:p>
     <w:p>
@@ -2302,7 +2293,7 @@
         <w:ind w:left="360"/>
       </w:pPr>
       <w:r>
-        <w:t xml:space="preserve">• A arena apresenta os jogadores nas laterais, a bomba com contador no centro e um campo inferior amplo para acomodar palavras longas.</w:t>
+        <w:t xml:space="preserve">• A arena apresenta os jogadores ao redor da bomba, o contador no centro e um campo inferior amplo para acomodar palavras longas.</w:t>
       </w:r>
     </w:p>
     <w:p>
@@ -3033,6 +3024,46 @@
       </w:r>
       <w:r>
         <w:t xml:space="preserve">.</w:t>
+      </w:r>
+    </w:p>
+    <w:p>
+      <w:pPr>
+        <w:spacing w:after="30"/>
+      </w:pPr>
+    </w:p>
+    <w:p>
+      <w:pPr>
+        <w:spacing w:before="0" w:after="90"/>
+      </w:pPr>
+      <w:r>
+        <w:t xml:space="preserve">O usuário também pode selecionar trilhas instrumentais leves </w:t>
+      </w:r>
+      <w:r>
+        <w:rPr>
+          <w:color w:val="1E6B4F"/>
+        </w:rPr>
+        <w:t xml:space="preserve">lounge_01()</w:t>
+      </w:r>
+      <w:r>
+        <w:t xml:space="preserve"> e </w:t>
+      </w:r>
+      <w:r>
+        <w:rPr>
+          <w:color w:val="1E6B4F"/>
+        </w:rPr>
+        <w:t xml:space="preserve">lounge_02()</w:t>
+      </w:r>
+      <w:r>
+        <w:t xml:space="preserve"> ou manter </w:t>
+      </w:r>
+      <w:r>
+        <w:rPr>
+          <w:color w:val="1E6B4F"/>
+        </w:rPr>
+        <w:t xml:space="preserve">music_off()</w:t>
+      </w:r>
+      <w:r>
+        <w:t xml:space="preserve">. As melodias são sintetizadas no navegador, sem arquivos de áudio adicionais, e a preferência também é persistida localmente.</w:t>
       </w:r>
     </w:p>
     <w:p>

</xml_diff>

<commit_message>
feat: add pedagogical word bomb levels and rematch
</commit_message>
<xml_diff>
--- a/docs/Poli-English-Duel-Documentacao-Oficial.docx
+++ b/docs/Poli-English-Duel-Documentacao-Oficial.docx
@@ -2140,16 +2140,88 @@
         <w:ind w:left="360"/>
       </w:pPr>
       <w:r>
-        <w:t xml:space="preserve">• O host escolhe o idioma ao criar a sala.</w:t>
-      </w:r>
-    </w:p>
-    <w:p>
-      <w:pPr>
-        <w:spacing w:before="0" w:after="40"/>
-        <w:ind w:left="360"/>
-      </w:pPr>
-      <w:r>
         <w:t xml:space="preserve">• Uma sala aceita até oito participantes.</w:t>
+      </w:r>
+    </w:p>
+    <w:p>
+      <w:pPr>
+        <w:spacing w:before="0" w:after="40"/>
+        <w:ind w:left="360"/>
+      </w:pPr>
+      <w:r>
+        <w:t xml:space="preserve">• O host escolhe o idioma e o nível pedagógico das sílabas antes de criar a sala.</w:t>
+      </w:r>
+    </w:p>
+    <w:p>
+      <w:pPr>
+        <w:spacing w:before="0" w:after="40"/>
+        <w:ind w:left="360"/>
+      </w:pPr>
+      <w:r>
+        <w:t xml:space="preserve">• O nível </w:t>
+      </w:r>
+      <w:r>
+        <w:rPr>
+          <w:color w:val="1E6B4F"/>
+        </w:rPr>
+        <w:t xml:space="preserve">easy</w:t>
+      </w:r>
+      <w:r>
+        <w:t xml:space="preserve"> usa pares cotidianos como </w:t>
+      </w:r>
+      <w:r>
+        <w:rPr>
+          <w:color w:val="1E6B4F"/>
+        </w:rPr>
+        <w:t xml:space="preserve">CA</w:t>
+      </w:r>
+      <w:r>
+        <w:t xml:space="preserve">, </w:t>
+      </w:r>
+      <w:r>
+        <w:rPr>
+          <w:color w:val="1E6B4F"/>
+        </w:rPr>
+        <w:t xml:space="preserve">BA</w:t>
+      </w:r>
+      <w:r>
+        <w:t xml:space="preserve"> e </w:t>
+      </w:r>
+      <w:r>
+        <w:rPr>
+          <w:color w:val="1E6B4F"/>
+        </w:rPr>
+        <w:t xml:space="preserve">TA</w:t>
+      </w:r>
+      <w:r>
+        <w:t xml:space="preserve">; </w:t>
+      </w:r>
+      <w:r>
+        <w:rPr>
+          <w:color w:val="1E6B4F"/>
+        </w:rPr>
+        <w:t xml:space="preserve">medium</w:t>
+      </w:r>
+      <w:r>
+        <w:t xml:space="preserve"> usa combinações frequentes; </w:t>
+      </w:r>
+      <w:r>
+        <w:rPr>
+          <w:color w:val="1E6B4F"/>
+        </w:rPr>
+        <w:t xml:space="preserve">hard</w:t>
+      </w:r>
+      <w:r>
+        <w:t xml:space="preserve"> libera trechos internos e encontros consonantais como </w:t>
+      </w:r>
+      <w:r>
+        <w:rPr>
+          <w:color w:val="1E6B4F"/>
+        </w:rPr>
+        <w:t xml:space="preserve">ST</w:t>
+      </w:r>
+      <w:r>
+        <w:t xml:space="preserve">.</w:t>
       </w:r>
     </w:p>
     <w:p>
@@ -2221,6 +2293,33 @@
         <w:ind w:left="360"/>
       </w:pPr>
       <w:r>
+        <w:t xml:space="preserve">• Em português, a normalização ignora acentos: </w:t>
+      </w:r>
+      <w:r>
+        <w:rPr>
+          <w:color w:val="1E6B4F"/>
+        </w:rPr>
+        <w:t xml:space="preserve">maçã</w:t>
+      </w:r>
+      <w:r>
+        <w:t xml:space="preserve"> e </w:t>
+      </w:r>
+      <w:r>
+        <w:rPr>
+          <w:color w:val="1E6B4F"/>
+        </w:rPr>
+        <w:t xml:space="preserve">maca</w:t>
+      </w:r>
+      <w:r>
+        <w:t xml:space="preserve"> são aceitas como a mesma palavra.</w:t>
+      </w:r>
+    </w:p>
+    <w:p>
+      <w:pPr>
+        <w:spacing w:before="0" w:after="40"/>
+        <w:ind w:left="360"/>
+      </w:pPr>
+      <w:r>
         <w:t xml:space="preserve">• Uma resposta válida concede </w:t>
       </w:r>
       <w:r>
@@ -2294,6 +2393,24 @@
       </w:pPr>
       <w:r>
         <w:t xml:space="preserve">• A arena apresenta os jogadores ao redor da bomba, o contador no centro e um campo inferior amplo para acomodar palavras longas.</w:t>
+      </w:r>
+    </w:p>
+    <w:p>
+      <w:pPr>
+        <w:spacing w:before="0" w:after="40"/>
+        <w:ind w:left="360"/>
+      </w:pPr>
+      <w:r>
+        <w:t xml:space="preserve">• Um convite por link leva o usuário autenticado diretamente ao lobby configurado pelo host, sem reabrir o seletor de idioma.</w:t>
+      </w:r>
+    </w:p>
+    <w:p>
+      <w:pPr>
+        <w:spacing w:before="0" w:after="40"/>
+        <w:ind w:left="360"/>
+      </w:pPr>
+      <w:r>
+        <w:t xml:space="preserve">• Ao final, qualquer participante pode restaurar o lobby pelo botão de revanche. Placares, corações e confirmações de pronto são reiniciados.</w:t>
       </w:r>
     </w:p>
     <w:p>
@@ -7356,7 +7473,7 @@
               <w:spacing w:after="0"/>
             </w:pPr>
             <w:r>
-              <w:t xml:space="preserve">Criar sala e escolher idioma</w:t>
+              <w:t xml:space="preserve">Criar sala e escolher idioma e nível</w:t>
             </w:r>
           </w:p>
         </w:tc>
@@ -7875,6 +7992,80 @@
             </w:pPr>
             <w:r>
               <w:t xml:space="preserve">Sair da sala</w:t>
+            </w:r>
+          </w:p>
+        </w:tc>
+      </w:tr>
+      <w:tr>
+        <w:tc>
+          <w:tcPr>
+            <w:tcMar>
+              <w:top w:w="80" w:type="dxa"/>
+              <w:left w:w="100" w:type="dxa"/>
+              <w:bottom w:w="80" w:type="dxa"/>
+              <w:right w:w="100" w:type="dxa"/>
+            </w:tcMar>
+          </w:tcPr>
+          <w:p>
+            <w:pPr>
+              <w:spacing w:after="0"/>
+            </w:pPr>
+            <w:r>
+              <w:t xml:space="preserve"/>
+            </w:r>
+            <w:r>
+              <w:rPr>
+                <w:color w:val="1E6B4F"/>
+              </w:rPr>
+              <w:t xml:space="preserve">POST</w:t>
+            </w:r>
+            <w:r>
+              <w:t xml:space="preserve"/>
+            </w:r>
+          </w:p>
+        </w:tc>
+        <w:tc>
+          <w:tcPr>
+            <w:tcMar>
+              <w:top w:w="80" w:type="dxa"/>
+              <w:left w:w="100" w:type="dxa"/>
+              <w:bottom w:w="80" w:type="dxa"/>
+              <w:right w:w="100" w:type="dxa"/>
+            </w:tcMar>
+          </w:tcPr>
+          <w:p>
+            <w:pPr>
+              <w:spacing w:after="0"/>
+            </w:pPr>
+            <w:r>
+              <w:t xml:space="preserve"/>
+            </w:r>
+            <w:r>
+              <w:rPr>
+                <w:color w:val="1E6B4F"/>
+              </w:rPr>
+              <w:t xml:space="preserve">/api/bombs/&lt;code&gt;/rematch</w:t>
+            </w:r>
+            <w:r>
+              <w:t xml:space="preserve"/>
+            </w:r>
+          </w:p>
+        </w:tc>
+        <w:tc>
+          <w:tcPr>
+            <w:tcMar>
+              <w:top w:w="80" w:type="dxa"/>
+              <w:left w:w="100" w:type="dxa"/>
+              <w:bottom w:w="80" w:type="dxa"/>
+              <w:right w:w="100" w:type="dxa"/>
+            </w:tcMar>
+          </w:tcPr>
+          <w:p>
+            <w:pPr>
+              <w:spacing w:after="0"/>
+            </w:pPr>
+            <w:r>
+              <w:t xml:space="preserve">Restaurar lobby para uma revanche</w:t>
             </w:r>
           </w:p>
         </w:tc>

</xml_diff>

<commit_message>
feat: make word bomb difficulty progressive
</commit_message>
<xml_diff>
--- a/docs/Poli-English-Duel-Documentacao-Oficial.docx
+++ b/docs/Poli-English-Duel-Documentacao-Oficial.docx
@@ -2149,25 +2149,70 @@
         <w:ind w:left="360"/>
       </w:pPr>
       <w:r>
-        <w:t xml:space="preserve">• O host escolhe o idioma e o nível pedagógico das sílabas antes de criar a sala.</w:t>
-      </w:r>
-    </w:p>
-    <w:p>
-      <w:pPr>
-        <w:spacing w:before="0" w:after="40"/>
-        <w:ind w:left="360"/>
-      </w:pPr>
-      <w:r>
-        <w:t xml:space="preserve">• O nível </w:t>
+        <w:t xml:space="preserve">• O host escolhe somente o idioma antes de criar a sala.</w:t>
+      </w:r>
+    </w:p>
+    <w:p>
+      <w:pPr>
+        <w:spacing w:before="0" w:after="40"/>
+        <w:ind w:left="360"/>
+      </w:pPr>
+      <w:r>
+        <w:t xml:space="preserve">• A dificuldade cresce automaticamente durante a partida em nove etapas: </w:t>
       </w:r>
       <w:r>
         <w:rPr>
           <w:color w:val="1E6B4F"/>
         </w:rPr>
-        <w:t xml:space="preserve">easy</w:t>
-      </w:r>
-      <w:r>
-        <w:t xml:space="preserve"> usa pares cotidianos como </w:t>
+        <w:t xml:space="preserve">EASY 1–3</w:t>
+      </w:r>
+      <w:r>
+        <w:t xml:space="preserve">, </w:t>
+      </w:r>
+      <w:r>
+        <w:rPr>
+          <w:color w:val="1E6B4F"/>
+        </w:rPr>
+        <w:t xml:space="preserve">MEDIUM 1–3</w:t>
+      </w:r>
+      <w:r>
+        <w:t xml:space="preserve"> e </w:t>
+      </w:r>
+      <w:r>
+        <w:rPr>
+          <w:color w:val="1E6B4F"/>
+        </w:rPr>
+        <w:t xml:space="preserve">HARD 1–3</w:t>
+      </w:r>
+      <w:r>
+        <w:t xml:space="preserve">.</w:t>
+      </w:r>
+    </w:p>
+    <w:p>
+      <w:pPr>
+        <w:spacing w:before="0" w:after="40"/>
+        <w:ind w:left="360"/>
+      </w:pPr>
+      <w:r>
+        <w:t xml:space="preserve">• Cada subnível dura aleatoriamente de cinco a sete rodadas. O marco seguinte fica persistido na sala para que todos os participantes enxerguem a mesma progressão.</w:t>
+      </w:r>
+    </w:p>
+    <w:p>
+      <w:pPr>
+        <w:spacing w:before="0" w:after="40"/>
+        <w:ind w:left="360"/>
+      </w:pPr>
+      <w:r>
+        <w:t xml:space="preserve">• O cabeçalho da arena exibe o subnível atual e quantas rodadas faltam para o próximo avanço.</w:t>
+      </w:r>
+    </w:p>
+    <w:p>
+      <w:pPr>
+        <w:spacing w:before="0" w:after="40"/>
+        <w:ind w:left="360"/>
+      </w:pPr>
+      <w:r>
+        <w:t xml:space="preserve">• Os níveis iniciais usam pares cotidianos como </w:t>
       </w:r>
       <w:r>
         <w:rPr>
@@ -2194,25 +2239,7 @@
         <w:t xml:space="preserve">TA</w:t>
       </w:r>
       <w:r>
-        <w:t xml:space="preserve">; </w:t>
-      </w:r>
-      <w:r>
-        <w:rPr>
-          <w:color w:val="1E6B4F"/>
-        </w:rPr>
-        <w:t xml:space="preserve">medium</w:t>
-      </w:r>
-      <w:r>
-        <w:t xml:space="preserve"> usa combinações frequentes; </w:t>
-      </w:r>
-      <w:r>
-        <w:rPr>
-          <w:color w:val="1E6B4F"/>
-        </w:rPr>
-        <w:t xml:space="preserve">hard</w:t>
-      </w:r>
-      <w:r>
-        <w:t xml:space="preserve"> libera trechos internos e encontros consonantais como </w:t>
+        <w:t xml:space="preserve">; os intermediários usam combinações frequentes; os avançados liberam trechos internos e encontros consonantais como </w:t>
       </w:r>
       <w:r>
         <w:rPr>
@@ -2410,7 +2437,16 @@
         <w:ind w:left="360"/>
       </w:pPr>
       <w:r>
-        <w:t xml:space="preserve">• Ao final, qualquer participante pode restaurar o lobby pelo botão de revanche. Placares, corações e confirmações de pronto são reiniciados.</w:t>
+        <w:t xml:space="preserve">• Ao final, qualquer participante pode restaurar o lobby pelo botão de revanche. Placares, corações, confirmações de pronto e progressão são reiniciados em </w:t>
+      </w:r>
+      <w:r>
+        <w:rPr>
+          <w:color w:val="1E6B4F"/>
+        </w:rPr>
+        <w:t xml:space="preserve">EASY 1</w:t>
+      </w:r>
+      <w:r>
+        <w:t xml:space="preserve">.</w:t>
       </w:r>
     </w:p>
     <w:p>
@@ -7473,7 +7509,16 @@
               <w:spacing w:after="0"/>
             </w:pPr>
             <w:r>
-              <w:t xml:space="preserve">Criar sala e escolher idioma e nível</w:t>
+              <w:t xml:space="preserve">Criar sala, escolher idioma e iniciar progressão em </w:t>
+            </w:r>
+            <w:r>
+              <w:rPr>
+                <w:color w:val="1E6B4F"/>
+              </w:rPr>
+              <w:t xml:space="preserve">EASY 1</w:t>
+            </w:r>
+            <w:r>
+              <w:t xml:space="preserve"/>
             </w:r>
           </w:p>
         </w:tc>

</xml_diff>

<commit_message>
feat: polish word bomb arena and sound design
</commit_message>
<xml_diff>
--- a/docs/Poli-English-Duel-Documentacao-Oficial.docx
+++ b/docs/Poli-English-Duel-Documentacao-Oficial.docx
@@ -2410,6 +2410,15 @@
         <w:ind w:left="360"/>
       </w:pPr>
       <w:r>
+        <w:t xml:space="preserve">• A seta usa uma trilha segmentada luminosa atrás da bomba e dos cards, preservando a leitura visual da arena.</w:t>
+      </w:r>
+    </w:p>
+    <w:p>
+      <w:pPr>
+        <w:spacing w:before="0" w:after="40"/>
+        <w:ind w:left="360"/>
+      </w:pPr>
+      <w:r>
         <w:t xml:space="preserve">• Nos três segundos finais, a arena, o contador e a barra recebem um alerta visual vermelho pulsante.</w:t>
       </w:r>
     </w:p>
@@ -2447,6 +2456,15 @@
       </w:r>
       <w:r>
         <w:t xml:space="preserve">.</w:t>
+      </w:r>
+    </w:p>
+    <w:p>
+      <w:pPr>
+        <w:spacing w:before="0" w:after="40"/>
+        <w:ind w:left="360"/>
+      </w:pPr>
+      <w:r>
+        <w:t xml:space="preserve">• Ao encerrar, a arena troca o tabuleiro por um painel final com vencedor e placar completo.</w:t>
       </w:r>
     </w:p>
     <w:p>
@@ -3217,6 +3235,28 @@
       </w:r>
       <w:r>
         <w:t xml:space="preserve">. As melodias são sintetizadas no navegador, sem arquivos de áudio adicionais, e a preferência também é persistida localmente.</w:t>
+      </w:r>
+    </w:p>
+    <w:p>
+      <w:pPr>
+        <w:spacing w:after="30"/>
+      </w:pPr>
+    </w:p>
+    <w:p>
+      <w:pPr>
+        <w:spacing w:before="0" w:after="90"/>
+      </w:pPr>
+      <w:r>
+        <w:t xml:space="preserve">O </w:t>
+      </w:r>
+      <w:r>
+        <w:rPr>
+          <w:color w:val="1E6B4F"/>
+        </w:rPr>
+        <w:t xml:space="preserve">Word Bomb</w:t>
+      </w:r>
+      <w:r>
+        <w:t xml:space="preserve"> sintetiza efeitos próprios para resposta correta, resposta inválida, explosão por timeout e vitória. Cada evento é reproduzido uma única vez, mesmo com a atualização periódica do estado multiplayer.</w:t>
       </w:r>
     </w:p>
     <w:p>

</xml_diff>

<commit_message>
fix: separate word bomb lobby from battle arena
</commit_message>
<xml_diff>
--- a/docs/Poli-English-Duel-Documentacao-Oficial.docx
+++ b/docs/Poli-English-Duel-Documentacao-Oficial.docx
@@ -2266,6 +2266,15 @@
         <w:ind w:left="360"/>
       </w:pPr>
       <w:r>
+        <w:t xml:space="preserve">• O lobby exibe uma lista compacta com foto, nome e estado dos participantes. A bomba e o cronômetro permanecem ocultos até o início da partida.</w:t>
+      </w:r>
+    </w:p>
+    <w:p>
+      <w:pPr>
+        <w:spacing w:before="0" w:after="40"/>
+        <w:ind w:left="360"/>
+      </w:pPr>
+      <w:r>
         <w:t xml:space="preserve">• A partida não começa automaticamente: somente o host pode iniciá-la, e o botão fica disponível quando todos estiverem prontos.</w:t>
       </w:r>
     </w:p>
@@ -2402,6 +2411,15 @@
       </w:pPr>
       <w:r>
         <w:t xml:space="preserve">• Os jogadores são distribuídos simetricamente ao redor da bomba. Uma seta sai do centro e aponta diretamente para o participante responsável pelo turno.</w:t>
+      </w:r>
+    </w:p>
+    <w:p>
+      <w:pPr>
+        <w:spacing w:before="0" w:after="40"/>
+        <w:ind w:left="360"/>
+      </w:pPr>
+      <w:r>
+        <w:t xml:space="preserve">• Durante a rodada ativa, os cards ficam afastados do cronômetro para preservar uma área central legível.</w:t>
       </w:r>
     </w:p>
     <w:p>

</xml_diff>

<commit_message>
feat: add word chain and realtime room signals
</commit_message>
<xml_diff>
--- a/docs/Poli-English-Duel-Documentacao-Oficial.docx
+++ b/docs/Poli-English-Duel-Documentacao-Oficial.docx
@@ -230,7 +230,7 @@
         <w:spacing w:before="0" w:after="90"/>
       </w:pPr>
       <w:r>
-        <w:t xml:space="preserve">O objetivo central é transformar o estudo de vocabulário em sessões curtas e competitivas. Em vez de apresentar listas estáticas, o jogo oferece quatro experiências:</w:t>
+        <w:t xml:space="preserve">O objetivo central é transformar o estudo de vocabulário em sessões curtas e competitivas. Em vez de apresentar listas estáticas, o jogo oferece cinco experiências:</w:t>
       </w:r>
     </w:p>
     <w:p>
@@ -308,6 +308,24 @@
       </w:r>
       <w:r>
         <w:t xml:space="preserve"> loop multiplayer de palavras com trecho obrigatório, lobby e digitação ao vivo.</w:t>
+      </w:r>
+    </w:p>
+    <w:p>
+      <w:pPr>
+        <w:spacing w:before="0" w:after="40"/>
+        <w:ind w:left="360"/>
+      </w:pPr>
+      <w:r>
+        <w:t xml:space="preserve">• </w:t>
+      </w:r>
+      <w:r>
+        <w:rPr>
+          <w:b/>
+        </w:rPr>
+        <w:t xml:space="preserve">Word Chain:</w:t>
+      </w:r>
+      <w:r>
+        <w:t xml:space="preserve"> corrente multiplayer em que a última sílaba válida vira requisito da próxima palavra.</w:t>
       </w:r>
     </w:p>
     <w:p>
@@ -640,7 +658,7 @@
               <w:spacing w:after="0"/>
             </w:pPr>
             <w:r>
-              <w:t xml:space="preserve">Criação de salas, entrada por código e atualização periódica do estado</w:t>
+              <w:t xml:space="preserve">Criação de salas, entrada por código e atualização via sinais Realtime</w:t>
             </w:r>
           </w:p>
         </w:tc>
@@ -831,6 +849,44 @@
             </w:pPr>
             <w:r>
               <w:t xml:space="preserve">Sala multiplayer para até oito participantes com lobby, turnos e digitação ao vivo</w:t>
+            </w:r>
+          </w:p>
+        </w:tc>
+      </w:tr>
+      <w:tr>
+        <w:tc>
+          <w:tcPr>
+            <w:tcMar>
+              <w:top w:w="80" w:type="dxa"/>
+              <w:left w:w="100" w:type="dxa"/>
+              <w:bottom w:w="80" w:type="dxa"/>
+              <w:right w:w="100" w:type="dxa"/>
+            </w:tcMar>
+          </w:tcPr>
+          <w:p>
+            <w:pPr>
+              <w:spacing w:after="0"/>
+            </w:pPr>
+            <w:r>
+              <w:t xml:space="preserve">Word Chain</w:t>
+            </w:r>
+          </w:p>
+        </w:tc>
+        <w:tc>
+          <w:tcPr>
+            <w:tcMar>
+              <w:top w:w="80" w:type="dxa"/>
+              <w:left w:w="100" w:type="dxa"/>
+              <w:bottom w:w="80" w:type="dxa"/>
+              <w:right w:w="100" w:type="dxa"/>
+            </w:tcMar>
+          </w:tcPr>
+          <w:p>
+            <w:pPr>
+              <w:spacing w:after="0"/>
+            </w:pPr>
+            <w:r>
+              <w:t xml:space="preserve">Variante em corrente do Word Bomb com primeira palavra livre e sílaba herdada</w:t>
             </w:r>
           </w:p>
         </w:tc>
@@ -2509,7 +2565,7 @@
         <w:spacing w:before="0" w:after="90"/>
       </w:pPr>
       <w:r>
-        <w:t xml:space="preserve">O Python continua autoritativo para lobby, participantes, início, turnos, validação, vidas, encerramento, XP e histórico. O Firebase Realtime Database transporta apenas o rascunho temporário digitado pelo jogador ativo. Esse dado não concede pontos e não altera o resultado da partida.</w:t>
+        <w:t xml:space="preserve">O Python continua autoritativo para lobby, participantes, início, turnos, validação, vidas, encerramento, XP e histórico. O Firebase Realtime Database transporta rascunhos temporários de digitação e sinais leves de atualização para acordar salas, contextos e convites sem polling contínuo. Esses dados não concedem pontos e não alteram o resultado da partida.</w:t>
       </w:r>
     </w:p>
     <w:p>
@@ -2523,6 +2579,92 @@
       </w:pPr>
       <w:r>
         <w:t xml:space="preserve">Para ampliar a aceitação de respostas sem sobrecarregar o espaço do PythonAnywhere, o backend também pode consultar blocos públicos de vocabulário particionados por idioma e prefixo no Realtime Database. Cada bloco é mantido em cache após a primeira consulta. A indisponibilidade do Firebase não interrompe a partida, pois a base local permanece como fallback.</w:t>
+      </w:r>
+    </w:p>
+    <w:p>
+      <w:pPr>
+        <w:spacing w:after="30"/>
+      </w:pPr>
+    </w:p>
+    <w:p>
+      <w:pPr>
+        <w:pStyle w:val="Heading2"/>
+        <w:spacing w:before="180" w:after="100"/>
+      </w:pPr>
+      <w:r>
+        <w:t xml:space="preserve">4.5 Word Chain</w:t>
+      </w:r>
+    </w:p>
+    <w:p>
+      <w:pPr>
+        <w:spacing w:after="30"/>
+      </w:pPr>
+    </w:p>
+    <w:p>
+      <w:pPr>
+        <w:spacing w:before="0" w:after="90"/>
+      </w:pPr>
+      <w:r>
+        <w:t xml:space="preserve">O </w:t>
+      </w:r>
+      <w:r>
+        <w:rPr>
+          <w:b/>
+        </w:rPr>
+        <w:t xml:space="preserve">Word Chain</w:t>
+      </w:r>
+      <w:r>
+        <w:t xml:space="preserve"> reutiliza lobby, turnos, cronômetro, validação e ranking do Word Bomb, mas troca o trecho fixo por uma corrente pedagógica.</w:t>
+      </w:r>
+    </w:p>
+    <w:p>
+      <w:pPr>
+        <w:spacing w:after="30"/>
+      </w:pPr>
+    </w:p>
+    <w:p>
+      <w:pPr>
+        <w:spacing w:before="0" w:after="40"/>
+        <w:ind w:left="360"/>
+      </w:pPr>
+      <w:r>
+        <w:t xml:space="preserve">• A primeira palavra é livre.</w:t>
+      </w:r>
+    </w:p>
+    <w:p>
+      <w:pPr>
+        <w:spacing w:before="0" w:after="40"/>
+        <w:ind w:left="360"/>
+      </w:pPr>
+      <w:r>
+        <w:t xml:space="preserve">• Após cada resposta válida, o backend calcula a sílaba final da palavra.</w:t>
+      </w:r>
+    </w:p>
+    <w:p>
+      <w:pPr>
+        <w:spacing w:before="0" w:after="40"/>
+        <w:ind w:left="360"/>
+      </w:pPr>
+      <w:r>
+        <w:t xml:space="preserve">• A próxima resposta precisa conter essa sílaba em qualquer posição.</w:t>
+      </w:r>
+    </w:p>
+    <w:p>
+      <w:pPr>
+        <w:spacing w:before="0" w:after="40"/>
+        <w:ind w:left="360"/>
+      </w:pPr>
+      <w:r>
+        <w:t xml:space="preserve">• Palavras repetidas são recusadas.</w:t>
+      </w:r>
+    </w:p>
+    <w:p>
+      <w:pPr>
+        <w:spacing w:before="0" w:after="40"/>
+        <w:ind w:left="360"/>
+      </w:pPr>
+      <w:r>
+        <w:t xml:space="preserve">• O Python continua autoritativo para validar vocabulário, pontuação, vidas e fim de partida.</w:t>
       </w:r>
     </w:p>
     <w:p>
@@ -2636,7 +2778,7 @@
         <w:ind w:left="360"/>
       </w:pPr>
       <w:r>
-        <w:t xml:space="preserve">• Word Bomb: </w:t>
+        <w:t xml:space="preserve">• Word Bomb e Word Chain: </w:t>
       </w:r>
       <w:r>
         <w:rPr>
@@ -3274,7 +3416,16 @@
         <w:t xml:space="preserve">Word Bomb</w:t>
       </w:r>
       <w:r>
-        <w:t xml:space="preserve"> sintetiza efeitos próprios para resposta correta, resposta inválida, explosão por timeout e vitória. Cada evento é reproduzido uma única vez, mesmo com a atualização periódica do estado multiplayer.</w:t>
+        <w:t xml:space="preserve"> e o </w:t>
+      </w:r>
+      <w:r>
+        <w:rPr>
+          <w:color w:val="1E6B4F"/>
+        </w:rPr>
+        <w:t xml:space="preserve">Word Chain</w:t>
+      </w:r>
+      <w:r>
+        <w:t xml:space="preserve"> sintetizam efeitos próprios para resposta correta, resposta inválida, explosão por timeout e vitória. Cada evento é reproduzido uma única vez, mesmo quando o estado multiplayer é atualizado por sinais Realtime.</w:t>
       </w:r>
     </w:p>
     <w:p>
@@ -3301,7 +3452,7 @@
         <w:spacing w:before="0" w:after="90"/>
       </w:pPr>
       <w:r>
-        <w:t xml:space="preserve">Após um duelo tradicional, um jogador pode solicitar uma revanche. O oponente recebe um modal explícito para aceitar ou recusar, tanto na tela final quanto no menu inicial. Se aceitar depois de o solicitante retornar ao menu, o polling retoma a sala reaberta automaticamente para os dois jogadores.</w:t>
+        <w:t xml:space="preserve">Após um duelo tradicional, um jogador pode solicitar uma revanche. O oponente recebe um modal explícito para aceitar ou recusar, tanto na tela final quanto no menu inicial. Se aceitar depois de o solicitante retornar ao menu, um sinal Realtime acorda o jogador e a sala reaberta é retomada automaticamente.</w:t>
       </w:r>
     </w:p>
     <w:p>
@@ -4326,11 +4477,11 @@
   v
 server.py / regras autoritativas do jogo
   |
-  +--&gt; SQLite: salas, Word Radar, Word Bomb, ranking e histórico
+  +--&gt; SQLite: salas, Word Radar, Word Bomb, Word Chain, ranking e histórico
   |
   +--&gt; Firebase Identity Toolkit: validação do token do usuário
   |
-  +--&gt; Firebase Realtime Database: digitação temporária ao vivo do Word Bomb</w:t>
+  +--&gt; Firebase Realtime Database: digitação temporária ao vivo e sinais leves de atualização</w:t>
       </w:r>
     </w:p>
     <w:p>
@@ -4909,7 +5060,7 @@
               <w:spacing w:after="0"/>
             </w:pPr>
             <w:r>
-              <w:t xml:space="preserve">Lobby e estado competitivo autoritativo das salas Word Bomb</w:t>
+              <w:t xml:space="preserve">Lobby e estado competitivo autoritativo das salas Word Bomb e Word Chain</w:t>
             </w:r>
           </w:p>
         </w:tc>
@@ -5282,7 +5433,43 @@
         <w:spacing w:before="0" w:after="90"/>
       </w:pPr>
       <w:r>
-        <w:t xml:space="preserve">O Firebase Realtime Database não recebe estado competitivo. No Word Bomb, ele transmite somente a digitação temporária ao vivo. Cada usuário autenticado pode escrever ou apagar apenas o próprio rascunho, limitado a 64 caracteres. O banco também expõe publicamente os blocos estáticos de vocabulário amplo:</w:t>
+        <w:t xml:space="preserve">O Firebase Realtime Database não recebe estado competitivo. No Word Bomb e no Word Chain, ele transmite a digitação temporária ao vivo. Ele também carrega sinais leves de atualização em </w:t>
+      </w:r>
+      <w:r>
+        <w:rPr>
+          <w:color w:val="1E6B4F"/>
+        </w:rPr>
+        <w:t xml:space="preserve">liveRooms</w:t>
+      </w:r>
+      <w:r>
+        <w:t xml:space="preserve">, </w:t>
+      </w:r>
+      <w:r>
+        <w:rPr>
+          <w:color w:val="1E6B4F"/>
+        </w:rPr>
+        <w:t xml:space="preserve">liveContexts</w:t>
+      </w:r>
+      <w:r>
+        <w:t xml:space="preserve">, </w:t>
+      </w:r>
+      <w:r>
+        <w:rPr>
+          <w:color w:val="1E6B4F"/>
+        </w:rPr>
+        <w:t xml:space="preserve">liveUsers</w:t>
+      </w:r>
+      <w:r>
+        <w:t xml:space="preserve"> e </w:t>
+      </w:r>
+      <w:r>
+        <w:rPr>
+          <w:color w:val="1E6B4F"/>
+        </w:rPr>
+        <w:t xml:space="preserve">liveBombRooms</w:t>
+      </w:r>
+      <w:r>
+        <w:t xml:space="preserve"> para substituir chamadas repetitivas de polling. Cada usuário autenticado pode escrever ou apagar apenas o próprio rascunho, limitado a 64 caracteres. O banco também expõe publicamente os blocos estáticos de vocabulário amplo:</w:t>
       </w:r>
     </w:p>
     <w:p>
@@ -10911,7 +11098,7 @@
         <w:t xml:space="preserve">Poli English Duel</w:t>
       </w:r>
       <w:r>
-        <w:t xml:space="preserve"> saiu de uma ideia de duelo de traduções para um MVP online com três modos, autenticação, persistência, ranking, histórico, conteúdo ampliado e uma arquitetura preparada para evoluir.</w:t>
+        <w:t xml:space="preserve"> saiu de uma ideia de duelo de traduções para um MVP online com cinco modos, autenticação, persistência, ranking, histórico, conteúdo ampliado e uma arquitetura preparada para evoluir.</w:t>
       </w:r>
     </w:p>
     <w:p>

</xml_diff>